<commit_message>
Polish Documentation/*.docx with branded reference template
Apply a custom reference template so Word output uses Microsoft brand
styling instead of pandoc defaults:
- Cover page: centered Segoe UI Light title in Bayside blue, italic
  subtitle with blue accent rule, author/date block
- Heading 1: Segoe UI Semibold 18pt, Bayside blue (#0F6CBD), bottom
  border; Heading 2/3 in darker blue (#2B579A)
- Tables: Segoe UI Semibold white-on-blue header row, light-blue zebra
  banding, tighter cell margins
- Blockquotes: blue left rule + light-blue fill, italic
- Code blocks: Cascadia Mono on light gray background; inline code
  matched
- TOC entries with right-aligned dot leaders
- Page header (title + 'Confidential . Microsoft Gaming') and page
  footer (author/version + 'Page X of Y')
- 1-inch margins on all four sides

Affects: SPEC.docx, ado-tasks.docx, ARCHITECTURE.docx

Co-authored-by: Copilot <223556219+Copilot@users.noreply.github.com>
</commit_message>
<xml_diff>
--- a/Documentation/ARCHITECTURE.docx
+++ b/Documentation/ARCHITECTURE.docx
@@ -7,7 +7,15 @@
         <w:pStyle w:val="Title"/>
       </w:pPr>
       <w:r>
-        <w:t xml:space="preserve">xCloud + xPlaytest Architecture Reference</w:t>
+        <w:t xml:space="preserve">Instantly Shareable Playtest</w:t>
+      </w:r>
+    </w:p>
+    <w:p>
+      <w:pPr>
+        <w:pStyle w:val="Subtitle"/>
+      </w:pPr>
+      <w:r>
+        <w:t xml:space="preserve">Code-Grounded Architecture Reference</w:t>
       </w:r>
     </w:p>
     <w:p>
@@ -15,7 +23,15 @@
         <w:pStyle w:val="Author"/>
       </w:pPr>
       <w:r>
-        <w:t xml:space="preserve">Melanie Chen</w:t>
+        <w:t xml:space="preserve">Melanie Chen · Microsoft Gaming Intern (Cloud Streaming)</w:t>
+      </w:r>
+    </w:p>
+    <w:p>
+      <w:pPr>
+        <w:pStyle w:val="Date"/>
+      </w:pPr>
+      <w:r>
+        <w:t xml:space="preserve">Draft v2 — June 2026</w:t>
       </w:r>
     </w:p>
     <w:sdt>
@@ -478,7 +494,7 @@
           <w:tcPr/>
           <w:p>
             <w:pPr>
-              <w:pStyle w:val="Compact"/>
+              <w:pStyle w:val="CompactParagraph"/>
             </w:pPr>
             <w:r>
               <w:t xml:space="preserve">Service</w:t>
@@ -489,7 +505,7 @@
           <w:tcPr/>
           <w:p>
             <w:pPr>
-              <w:pStyle w:val="Compact"/>
+              <w:pStyle w:val="CompactParagraph"/>
             </w:pPr>
             <w:r>
               <w:t xml:space="preserve">Repo</w:t>
@@ -500,7 +516,7 @@
           <w:tcPr/>
           <w:p>
             <w:pPr>
-              <w:pStyle w:val="Compact"/>
+              <w:pStyle w:val="CompactParagraph"/>
             </w:pPr>
             <w:r>
               <w:t xml:space="preserve">Role</w:t>
@@ -513,7 +529,7 @@
           <w:tcPr/>
           <w:p>
             <w:pPr>
-              <w:pStyle w:val="Compact"/>
+              <w:pStyle w:val="CompactParagraph"/>
             </w:pPr>
             <w:r>
               <w:t xml:space="preserve">xPlaytest</w:t>
@@ -524,7 +540,7 @@
           <w:tcPr/>
           <w:p>
             <w:pPr>
-              <w:pStyle w:val="Compact"/>
+              <w:pStyle w:val="CompactParagraph"/>
             </w:pPr>
             <w:r>
               <w:rPr>
@@ -538,7 +554,7 @@
           <w:tcPr/>
           <w:p>
             <w:pPr>
-              <w:pStyle w:val="Compact"/>
+              <w:pStyle w:val="CompactParagraph"/>
             </w:pPr>
             <w:r>
               <w:t xml:space="preserve">Authoring + publish orchestration; sole originator of the cross-tenant trigger</w:t>
@@ -551,7 +567,7 @@
           <w:tcPr/>
           <w:p>
             <w:pPr>
-              <w:pStyle w:val="Compact"/>
+              <w:pStyle w:val="CompactParagraph"/>
             </w:pPr>
             <w:r>
               <w:t xml:space="preserve">SAGE</w:t>
@@ -562,7 +578,7 @@
           <w:tcPr/>
           <w:p>
             <w:pPr>
-              <w:pStyle w:val="Compact"/>
+              <w:pStyle w:val="CompactParagraph"/>
             </w:pPr>
             <w:r>
               <w:rPr>
@@ -576,7 +592,7 @@
           <w:tcPr/>
           <w:p>
             <w:pPr>
-              <w:pStyle w:val="Compact"/>
+              <w:pStyle w:val="CompactParagraph"/>
             </w:pPr>
             <w:r>
               <w:t xml:space="preserve">Ingress gateway for cross-tenant calls into xCloud; route + auth policy enforcement</w:t>
@@ -589,7 +605,7 @@
           <w:tcPr/>
           <w:p>
             <w:pPr>
-              <w:pStyle w:val="Compact"/>
+              <w:pStyle w:val="CompactParagraph"/>
             </w:pPr>
             <w:r>
               <w:t xml:space="preserve">Content Ingestion</w:t>
@@ -600,7 +616,7 @@
           <w:tcPr/>
           <w:p>
             <w:pPr>
-              <w:pStyle w:val="Compact"/>
+              <w:pStyle w:val="CompactParagraph"/>
             </w:pPr>
             <w:r>
               <w:rPr>
@@ -614,7 +630,7 @@
           <w:tcPr/>
           <w:p>
             <w:pPr>
-              <w:pStyle w:val="Compact"/>
+              <w:pStyle w:val="CompactParagraph"/>
             </w:pPr>
             <w:r>
               <w:t xml:space="preserve">New</w:t>
@@ -642,7 +658,7 @@
           <w:tcPr/>
           <w:p>
             <w:pPr>
-              <w:pStyle w:val="Compact"/>
+              <w:pStyle w:val="CompactParagraph"/>
             </w:pPr>
             <w:r>
               <w:t xml:space="preserve">Partner Registry</w:t>
@@ -653,7 +669,7 @@
           <w:tcPr/>
           <w:p>
             <w:pPr>
-              <w:pStyle w:val="Compact"/>
+              <w:pStyle w:val="CompactParagraph"/>
             </w:pPr>
             <w:r>
               <w:rPr>
@@ -667,7 +683,7 @@
           <w:tcPr/>
           <w:p>
             <w:pPr>
-              <w:pStyle w:val="Compact"/>
+              <w:pStyle w:val="CompactParagraph"/>
             </w:pPr>
             <w:r>
               <w:t xml:space="preserve">Source of truth for</w:t>
@@ -1320,7 +1336,7 @@
           <w:tcPr/>
           <w:p>
             <w:pPr>
-              <w:pStyle w:val="Compact"/>
+              <w:pStyle w:val="CompactParagraph"/>
             </w:pPr>
             <w:r>
               <w:t xml:space="preserve">Concept</w:t>
@@ -1331,7 +1347,7 @@
           <w:tcPr/>
           <w:p>
             <w:pPr>
-              <w:pStyle w:val="Compact"/>
+              <w:pStyle w:val="CompactParagraph"/>
             </w:pPr>
             <w:r>
               <w:t xml:space="preserve">File</w:t>
@@ -1342,7 +1358,7 @@
           <w:tcPr/>
           <w:p>
             <w:pPr>
-              <w:pStyle w:val="Compact"/>
+              <w:pStyle w:val="CompactParagraph"/>
             </w:pPr>
             <w:r>
               <w:t xml:space="preserve">Notes</w:t>
@@ -1355,7 +1371,7 @@
           <w:tcPr/>
           <w:p>
             <w:pPr>
-              <w:pStyle w:val="Compact"/>
+              <w:pStyle w:val="CompactParagraph"/>
             </w:pPr>
             <w:r>
               <w:t xml:space="preserve">Publish HTTP endpoint</w:t>
@@ -1366,7 +1382,7 @@
           <w:tcPr/>
           <w:p>
             <w:pPr>
-              <w:pStyle w:val="Compact"/>
+              <w:pStyle w:val="CompactParagraph"/>
             </w:pPr>
             <w:r>
               <w:rPr>
@@ -1380,7 +1396,7 @@
           <w:tcPr/>
           <w:p>
             <w:pPr>
-              <w:pStyle w:val="Compact"/>
+              <w:pStyle w:val="CompactParagraph"/>
             </w:pPr>
             <w:r>
               <w:rPr>
@@ -1396,7 +1412,7 @@
           <w:tcPr/>
           <w:p>
             <w:pPr>
-              <w:pStyle w:val="Compact"/>
+              <w:pStyle w:val="CompactParagraph"/>
             </w:pPr>
             <w:r>
               <w:t xml:space="preserve">Publish queueing</w:t>
@@ -1407,7 +1423,7 @@
           <w:tcPr/>
           <w:p>
             <w:pPr>
-              <w:pStyle w:val="Compact"/>
+              <w:pStyle w:val="CompactParagraph"/>
             </w:pPr>
             <w:r>
               <w:rPr>
@@ -1421,7 +1437,7 @@
           <w:tcPr/>
           <w:p>
             <w:pPr>
-              <w:pStyle w:val="Compact"/>
+              <w:pStyle w:val="CompactParagraph"/>
             </w:pPr>
             <w:r>
               <w:rPr>
@@ -1437,7 +1453,7 @@
           <w:tcPr/>
           <w:p>
             <w:pPr>
-              <w:pStyle w:val="Compact"/>
+              <w:pStyle w:val="CompactParagraph"/>
             </w:pPr>
             <w:r>
               <w:t xml:space="preserve">Workflow class</w:t>
@@ -1448,7 +1464,7 @@
           <w:tcPr/>
           <w:p>
             <w:pPr>
-              <w:pStyle w:val="Compact"/>
+              <w:pStyle w:val="CompactParagraph"/>
             </w:pPr>
             <w:r>
               <w:rPr>
@@ -1462,7 +1478,7 @@
           <w:tcPr/>
           <w:p>
             <w:pPr>
-              <w:pStyle w:val="Compact"/>
+              <w:pStyle w:val="CompactParagraph"/>
             </w:pPr>
             <w:r>
               <w:t xml:space="preserve">Exponential retry policy</w:t>
@@ -1475,7 +1491,7 @@
           <w:tcPr/>
           <w:p>
             <w:pPr>
-              <w:pStyle w:val="Compact"/>
+              <w:pStyle w:val="CompactParagraph"/>
             </w:pPr>
             <w:r>
               <w:t xml:space="preserve">State machine</w:t>
@@ -1486,7 +1502,7 @@
           <w:tcPr/>
           <w:p>
             <w:pPr>
-              <w:pStyle w:val="Compact"/>
+              <w:pStyle w:val="CompactParagraph"/>
             </w:pPr>
             <w:r>
               <w:t xml:space="preserve">same file,</w:t>
@@ -1506,7 +1522,7 @@
           <w:tcPr/>
           <w:p>
             <w:pPr>
-              <w:pStyle w:val="Compact"/>
+              <w:pStyle w:val="CompactParagraph"/>
             </w:pPr>
             <w:r>
               <w:rPr>
@@ -1522,7 +1538,7 @@
           <w:tcPr/>
           <w:p>
             <w:pPr>
-              <w:pStyle w:val="Compact"/>
+              <w:pStyle w:val="CompactParagraph"/>
             </w:pPr>
             <w:r>
               <w:t xml:space="preserve">Job parameters</w:t>
@@ -1533,7 +1549,7 @@
           <w:tcPr/>
           <w:p>
             <w:pPr>
-              <w:pStyle w:val="Compact"/>
+              <w:pStyle w:val="CompactParagraph"/>
             </w:pPr>
             <w:r>
               <w:rPr>
@@ -1547,7 +1563,7 @@
           <w:tcPr/>
           <w:p>
             <w:pPr>
-              <w:pStyle w:val="Compact"/>
+              <w:pStyle w:val="CompactParagraph"/>
             </w:pPr>
             <w:r>
               <w:t xml:space="preserve">Has</w:t>
@@ -1605,7 +1621,7 @@
           <w:tcPr/>
           <w:p>
             <w:pPr>
-              <w:pStyle w:val="Compact"/>
+              <w:pStyle w:val="CompactParagraph"/>
             </w:pPr>
             <w:r>
               <w:t xml:space="preserve">Lifecycle state</w:t>
@@ -1616,7 +1632,7 @@
           <w:tcPr/>
           <w:p>
             <w:pPr>
-              <w:pStyle w:val="Compact"/>
+              <w:pStyle w:val="CompactParagraph"/>
             </w:pPr>
             <w:r>
               <w:rPr>
@@ -1630,7 +1646,7 @@
           <w:tcPr/>
           <w:p>
             <w:pPr>
-              <w:pStyle w:val="Compact"/>
+              <w:pStyle w:val="CompactParagraph"/>
             </w:pPr>
             <w:r>
               <w:t xml:space="preserve">Has</w:t>
@@ -1664,7 +1680,7 @@
           <w:tcPr/>
           <w:p>
             <w:pPr>
-              <w:pStyle w:val="Compact"/>
+              <w:pStyle w:val="CompactParagraph"/>
             </w:pPr>
             <w:r>
               <w:t xml:space="preserve">Status enum</w:t>
@@ -1675,7 +1691,7 @@
           <w:tcPr/>
           <w:p>
             <w:pPr>
-              <w:pStyle w:val="Compact"/>
+              <w:pStyle w:val="CompactParagraph"/>
             </w:pPr>
             <w:r>
               <w:rPr>
@@ -1689,7 +1705,7 @@
           <w:tcPr/>
           <w:p>
             <w:pPr>
-              <w:pStyle w:val="Compact"/>
+              <w:pStyle w:val="CompactParagraph"/>
             </w:pPr>
             <w:r>
               <w:rPr>
@@ -1735,7 +1751,7 @@
           <w:tcPr/>
           <w:p>
             <w:pPr>
-              <w:pStyle w:val="Compact"/>
+              <w:pStyle w:val="CompactParagraph"/>
             </w:pPr>
             <w:r>
               <w:t xml:space="preserve">Sandbox constant</w:t>
@@ -1746,7 +1762,7 @@
           <w:tcPr/>
           <w:p>
             <w:pPr>
-              <w:pStyle w:val="Compact"/>
+              <w:pStyle w:val="CompactParagraph"/>
             </w:pPr>
             <w:r>
               <w:rPr>
@@ -1760,7 +1776,7 @@
           <w:tcPr/>
           <w:p>
             <w:pPr>
-              <w:pStyle w:val="Compact"/>
+              <w:pStyle w:val="CompactParagraph"/>
             </w:pPr>
             <w:r>
               <w:rPr>
@@ -1776,7 +1792,7 @@
           <w:tcPr/>
           <w:p>
             <w:pPr>
-              <w:pStyle w:val="Compact"/>
+              <w:pStyle w:val="CompactParagraph"/>
             </w:pPr>
             <w:r>
               <w:t xml:space="preserve">Default platform constant</w:t>
@@ -1787,7 +1803,7 @@
           <w:tcPr/>
           <w:p>
             <w:pPr>
-              <w:pStyle w:val="Compact"/>
+              <w:pStyle w:val="CompactParagraph"/>
             </w:pPr>
             <w:r>
               <w:rPr>
@@ -1801,7 +1817,7 @@
           <w:tcPr/>
           <w:p>
             <w:pPr>
-              <w:pStyle w:val="Compact"/>
+              <w:pStyle w:val="CompactParagraph"/>
             </w:pPr>
             <w:r>
               <w:t xml:space="preserve">Lives in XProduct,</w:t>
@@ -1830,7 +1846,7 @@
           <w:tcPr/>
           <w:p>
             <w:pPr>
-              <w:pStyle w:val="Compact"/>
+              <w:pStyle w:val="CompactParagraph"/>
             </w:pPr>
             <w:r>
               <w:t xml:space="preserve">Product document builder</w:t>
@@ -1841,7 +1857,7 @@
           <w:tcPr/>
           <w:p>
             <w:pPr>
-              <w:pStyle w:val="Compact"/>
+              <w:pStyle w:val="CompactParagraph"/>
             </w:pPr>
             <w:r>
               <w:rPr>
@@ -1855,7 +1871,7 @@
           <w:tcPr/>
           <w:p>
             <w:pPr>
-              <w:pStyle w:val="Compact"/>
+              <w:pStyle w:val="CompactParagraph"/>
             </w:pPr>
             <w:r>
               <w:t xml:space="preserve">Currently hardcodes</w:t>
@@ -1887,7 +1903,7 @@
     </w:p>
     <w:p>
       <w:pPr>
-        <w:pStyle w:val="Compact"/>
+        <w:pStyle w:val="CompactParagraph"/>
         <w:numPr>
           <w:ilvl w:val="0"/>
           <w:numId w:val="1001"/>
@@ -1937,7 +1953,7 @@
     </w:p>
     <w:p>
       <w:pPr>
-        <w:pStyle w:val="Compact"/>
+        <w:pStyle w:val="CompactParagraph"/>
         <w:numPr>
           <w:ilvl w:val="0"/>
           <w:numId w:val="1001"/>
@@ -1990,7 +2006,7 @@
     </w:p>
     <w:p>
       <w:pPr>
-        <w:pStyle w:val="Compact"/>
+        <w:pStyle w:val="CompactParagraph"/>
         <w:numPr>
           <w:ilvl w:val="0"/>
           <w:numId w:val="1001"/>
@@ -2039,7 +2055,7 @@
     </w:p>
     <w:p>
       <w:pPr>
-        <w:pStyle w:val="Compact"/>
+        <w:pStyle w:val="CompactParagraph"/>
         <w:numPr>
           <w:ilvl w:val="0"/>
           <w:numId w:val="1001"/>
@@ -2136,7 +2152,7 @@
     </w:p>
     <w:p>
       <w:pPr>
-        <w:pStyle w:val="Compact"/>
+        <w:pStyle w:val="CompactParagraph"/>
         <w:numPr>
           <w:ilvl w:val="0"/>
           <w:numId w:val="1001"/>
@@ -2197,7 +2213,7 @@
     </w:p>
     <w:p>
       <w:pPr>
-        <w:pStyle w:val="Compact"/>
+        <w:pStyle w:val="CompactParagraph"/>
         <w:numPr>
           <w:ilvl w:val="0"/>
           <w:numId w:val="1001"/>
@@ -2261,7 +2277,7 @@
     </w:p>
     <w:p>
       <w:pPr>
-        <w:pStyle w:val="Compact"/>
+        <w:pStyle w:val="CompactParagraph"/>
         <w:numPr>
           <w:ilvl w:val="0"/>
           <w:numId w:val="1001"/>
@@ -2283,7 +2299,7 @@
     </w:p>
     <w:p>
       <w:pPr>
-        <w:pStyle w:val="Compact"/>
+        <w:pStyle w:val="CompactParagraph"/>
         <w:numPr>
           <w:ilvl w:val="0"/>
           <w:numId w:val="1001"/>
@@ -2341,7 +2357,7 @@
     </w:p>
     <w:p>
       <w:pPr>
-        <w:pStyle w:val="Compact"/>
+        <w:pStyle w:val="CompactParagraph"/>
         <w:numPr>
           <w:ilvl w:val="0"/>
           <w:numId w:val="1001"/>
@@ -2457,7 +2473,7 @@
           <w:tcPr/>
           <w:p>
             <w:pPr>
-              <w:pStyle w:val="Compact"/>
+              <w:pStyle w:val="CompactParagraph"/>
             </w:pPr>
             <w:r>
               <w:t xml:space="preserve">Concept</w:t>
@@ -2468,7 +2484,7 @@
           <w:tcPr/>
           <w:p>
             <w:pPr>
-              <w:pStyle w:val="Compact"/>
+              <w:pStyle w:val="CompactParagraph"/>
             </w:pPr>
             <w:r>
               <w:t xml:space="preserve">File</w:t>
@@ -2479,7 +2495,7 @@
           <w:tcPr/>
           <w:p>
             <w:pPr>
-              <w:pStyle w:val="Compact"/>
+              <w:pStyle w:val="CompactParagraph"/>
             </w:pPr>
             <w:r>
               <w:t xml:space="preserve">Notes</w:t>
@@ -2492,7 +2508,7 @@
           <w:tcPr/>
           <w:p>
             <w:pPr>
-              <w:pStyle w:val="Compact"/>
+              <w:pStyle w:val="CompactParagraph"/>
             </w:pPr>
             <w:r>
               <w:t xml:space="preserve">Route table</w:t>
@@ -2503,7 +2519,7 @@
           <w:tcPr/>
           <w:p>
             <w:pPr>
-              <w:pStyle w:val="Compact"/>
+              <w:pStyle w:val="CompactParagraph"/>
             </w:pPr>
             <w:r>
               <w:rPr>
@@ -2517,7 +2533,7 @@
           <w:tcPr/>
           <w:p>
             <w:pPr>
-              <w:pStyle w:val="Compact"/>
+              <w:pStyle w:val="CompactParagraph"/>
             </w:pPr>
             <w:r>
               <w:t xml:space="preserve">Config-driven</w:t>
@@ -2539,7 +2555,7 @@
           <w:tcPr/>
           <w:p>
             <w:pPr>
-              <w:pStyle w:val="Compact"/>
+              <w:pStyle w:val="CompactParagraph"/>
             </w:pPr>
             <w:r>
               <w:t xml:space="preserve">Proxy controller</w:t>
@@ -2550,7 +2566,7 @@
           <w:tcPr/>
           <w:p>
             <w:pPr>
-              <w:pStyle w:val="Compact"/>
+              <w:pStyle w:val="CompactParagraph"/>
             </w:pPr>
             <w:r>
               <w:rPr>
@@ -2564,7 +2580,7 @@
           <w:tcPr/>
           <w:p>
             <w:pPr>
-              <w:pStyle w:val="Compact"/>
+              <w:pStyle w:val="CompactParagraph"/>
             </w:pPr>
             <w:r>
               <w:t xml:space="preserve">Catch-all</w:t>
@@ -2586,7 +2602,7 @@
           <w:tcPr/>
           <w:p>
             <w:pPr>
-              <w:pStyle w:val="Compact"/>
+              <w:pStyle w:val="CompactParagraph"/>
             </w:pPr>
             <w:r>
               <w:t xml:space="preserve">Auth selection</w:t>
@@ -2597,7 +2613,7 @@
           <w:tcPr/>
           <w:p>
             <w:pPr>
-              <w:pStyle w:val="Compact"/>
+              <w:pStyle w:val="CompactParagraph"/>
             </w:pPr>
             <w:r>
               <w:t xml:space="preserve">same file,</w:t>
@@ -2617,7 +2633,7 @@
           <w:tcPr/>
           <w:p>
             <w:pPr>
-              <w:pStyle w:val="Compact"/>
+              <w:pStyle w:val="CompactParagraph"/>
             </w:pPr>
             <w:r>
               <w:rPr>
@@ -2657,7 +2673,7 @@
           <w:tcPr/>
           <w:p>
             <w:pPr>
-              <w:pStyle w:val="Compact"/>
+              <w:pStyle w:val="CompactParagraph"/>
             </w:pPr>
             <w:r>
               <w:t xml:space="preserve">Per-route SPN allow-list</w:t>
@@ -2668,7 +2684,7 @@
           <w:tcPr/>
           <w:p>
             <w:pPr>
-              <w:pStyle w:val="Compact"/>
+              <w:pStyle w:val="CompactParagraph"/>
             </w:pPr>
             <w:r>
               <w:t xml:space="preserve">same file,</w:t>
@@ -2688,7 +2704,7 @@
           <w:tcPr/>
           <w:p>
             <w:pPr>
-              <w:pStyle w:val="Compact"/>
+              <w:pStyle w:val="CompactParagraph"/>
             </w:pPr>
             <w:r>
               <w:rPr>
@@ -2704,7 +2720,7 @@
           <w:tcPr/>
           <w:p>
             <w:pPr>
-              <w:pStyle w:val="Compact"/>
+              <w:pStyle w:val="CompactParagraph"/>
             </w:pPr>
             <w:r>
               <w:t xml:space="preserve">Error response shape</w:t>
@@ -2715,7 +2731,7 @@
           <w:tcPr/>
           <w:p>
             <w:pPr>
-              <w:pStyle w:val="Compact"/>
+              <w:pStyle w:val="CompactParagraph"/>
             </w:pPr>
             <w:r>
               <w:t xml:space="preserve">same file,</w:t>
@@ -2735,7 +2751,7 @@
           <w:tcPr/>
           <w:p>
             <w:pPr>
-              <w:pStyle w:val="Compact"/>
+              <w:pStyle w:val="CompactParagraph"/>
             </w:pPr>
             <w:r>
               <w:t xml:space="preserve">Custom</w:t>
@@ -2772,7 +2788,7 @@
           <w:tcPr/>
           <w:p>
             <w:pPr>
-              <w:pStyle w:val="Compact"/>
+              <w:pStyle w:val="CompactParagraph"/>
             </w:pPr>
             <w:r>
               <w:t xml:space="preserve">Existing 202 pattern</w:t>
@@ -2783,7 +2799,7 @@
           <w:tcPr/>
           <w:p>
             <w:pPr>
-              <w:pStyle w:val="Compact"/>
+              <w:pStyle w:val="CompactParagraph"/>
             </w:pPr>
             <w:r>
               <w:t xml:space="preserve">(none)</w:t>
@@ -2794,7 +2810,7 @@
           <w:tcPr/>
           <w:p>
             <w:pPr>
-              <w:pStyle w:val="Compact"/>
+              <w:pStyle w:val="CompactParagraph"/>
             </w:pPr>
             <w:r>
               <w:t xml:space="preserve">Zero hits for</w:t>
@@ -2834,7 +2850,7 @@
           <w:tcPr/>
           <w:p>
             <w:pPr>
-              <w:pStyle w:val="Compact"/>
+              <w:pStyle w:val="CompactParagraph"/>
             </w:pPr>
             <w:r>
               <w:t xml:space="preserve">Callback framework</w:t>
@@ -2845,7 +2861,7 @@
           <w:tcPr/>
           <w:p>
             <w:pPr>
-              <w:pStyle w:val="Compact"/>
+              <w:pStyle w:val="CompactParagraph"/>
             </w:pPr>
             <w:r>
               <w:t xml:space="preserve">(none)</w:t>
@@ -2856,7 +2872,7 @@
           <w:tcPr/>
           <w:p>
             <w:pPr>
-              <w:pStyle w:val="Compact"/>
+              <w:pStyle w:val="CompactParagraph"/>
             </w:pPr>
             <w:r>
               <w:t xml:space="preserve">Routes named</w:t>
@@ -2897,7 +2913,7 @@
     </w:p>
     <w:p>
       <w:pPr>
-        <w:pStyle w:val="Compact"/>
+        <w:pStyle w:val="CompactParagraph"/>
         <w:numPr>
           <w:ilvl w:val="0"/>
           <w:numId w:val="1002"/>
@@ -2934,7 +2950,7 @@
     </w:p>
     <w:p>
       <w:pPr>
-        <w:pStyle w:val="Compact"/>
+        <w:pStyle w:val="CompactParagraph"/>
         <w:numPr>
           <w:ilvl w:val="1"/>
           <w:numId w:val="1003"/>
@@ -2964,7 +2980,7 @@
     </w:p>
     <w:p>
       <w:pPr>
-        <w:pStyle w:val="Compact"/>
+        <w:pStyle w:val="CompactParagraph"/>
         <w:numPr>
           <w:ilvl w:val="1"/>
           <w:numId w:val="1003"/>
@@ -3027,7 +3043,7 @@
     </w:p>
     <w:p>
       <w:pPr>
-        <w:pStyle w:val="Compact"/>
+        <w:pStyle w:val="CompactParagraph"/>
         <w:numPr>
           <w:ilvl w:val="0"/>
           <w:numId w:val="1002"/>
@@ -3049,7 +3065,7 @@
     </w:p>
     <w:p>
       <w:pPr>
-        <w:pStyle w:val="Compact"/>
+        <w:pStyle w:val="CompactParagraph"/>
         <w:numPr>
           <w:ilvl w:val="0"/>
           <w:numId w:val="1002"/>
@@ -3168,7 +3184,7 @@
           <w:tcPr/>
           <w:p>
             <w:pPr>
-              <w:pStyle w:val="Compact"/>
+              <w:pStyle w:val="CompactParagraph"/>
             </w:pPr>
             <w:r>
               <w:t xml:space="preserve">Concept</w:t>
@@ -3179,7 +3195,7 @@
           <w:tcPr/>
           <w:p>
             <w:pPr>
-              <w:pStyle w:val="Compact"/>
+              <w:pStyle w:val="CompactParagraph"/>
             </w:pPr>
             <w:r>
               <w:t xml:space="preserve">File</w:t>
@@ -3190,7 +3206,7 @@
           <w:tcPr/>
           <w:p>
             <w:pPr>
-              <w:pStyle w:val="Compact"/>
+              <w:pStyle w:val="CompactParagraph"/>
             </w:pPr>
             <w:r>
               <w:t xml:space="preserve">Notes</w:t>
@@ -3203,7 +3219,7 @@
           <w:tcPr/>
           <w:p>
             <w:pPr>
-              <w:pStyle w:val="Compact"/>
+              <w:pStyle w:val="CompactParagraph"/>
             </w:pPr>
             <w:r>
               <w:rPr>
@@ -3223,7 +3239,7 @@
           <w:tcPr/>
           <w:p>
             <w:pPr>
-              <w:pStyle w:val="Compact"/>
+              <w:pStyle w:val="CompactParagraph"/>
             </w:pPr>
             <w:r>
               <w:rPr>
@@ -3237,7 +3253,7 @@
           <w:tcPr/>
           <w:p>
             <w:pPr>
-              <w:pStyle w:val="Compact"/>
+              <w:pStyle w:val="CompactParagraph"/>
             </w:pPr>
             <w:r>
               <w:rPr>
@@ -3253,7 +3269,7 @@
           <w:tcPr/>
           <w:p>
             <w:pPr>
-              <w:pStyle w:val="Compact"/>
+              <w:pStyle w:val="CompactParagraph"/>
             </w:pPr>
             <w:r>
               <w:rPr>
@@ -3267,7 +3283,7 @@
           <w:tcPr/>
           <w:p>
             <w:pPr>
-              <w:pStyle w:val="Compact"/>
+              <w:pStyle w:val="CompactParagraph"/>
             </w:pPr>
             <w:r>
               <w:t xml:space="preserve">same file,</w:t>
@@ -3287,7 +3303,7 @@
           <w:tcPr/>
           <w:p>
             <w:pPr>
-              <w:pStyle w:val="Compact"/>
+              <w:pStyle w:val="CompactParagraph"/>
             </w:pPr>
             <w:r>
               <w:t xml:space="preserve">Throws if game and</w:t>
@@ -3330,7 +3346,7 @@
           <w:tcPr/>
           <w:p>
             <w:pPr>
-              <w:pStyle w:val="Compact"/>
+              <w:pStyle w:val="CompactParagraph"/>
             </w:pPr>
             <w:r>
               <w:rPr>
@@ -3344,7 +3360,7 @@
           <w:tcPr/>
           <w:p>
             <w:pPr>
-              <w:pStyle w:val="Compact"/>
+              <w:pStyle w:val="CompactParagraph"/>
             </w:pPr>
             <w:r>
               <w:rPr>
@@ -3358,7 +3374,7 @@
           <w:tcPr/>
           <w:p>
             <w:pPr>
-              <w:pStyle w:val="Compact"/>
+              <w:pStyle w:val="CompactParagraph"/>
             </w:pPr>
             <w:r>
               <w:t xml:space="preserve">Accepts</w:t>
@@ -3395,7 +3411,7 @@
           <w:tcPr/>
           <w:p>
             <w:pPr>
-              <w:pStyle w:val="Compact"/>
+              <w:pStyle w:val="CompactParagraph"/>
             </w:pPr>
             <w:r>
               <w:rPr>
@@ -3409,7 +3425,7 @@
           <w:tcPr/>
           <w:p>
             <w:pPr>
-              <w:pStyle w:val="Compact"/>
+              <w:pStyle w:val="CompactParagraph"/>
             </w:pPr>
             <w:r>
               <w:rPr>
@@ -3423,7 +3439,7 @@
           <w:tcPr/>
           <w:p>
             <w:pPr>
-              <w:pStyle w:val="Compact"/>
+              <w:pStyle w:val="CompactParagraph"/>
             </w:pPr>
             <w:r>
               <w:t xml:space="preserve">Outer orchestration we chain into</w:t>
@@ -3436,7 +3452,7 @@
           <w:tcPr/>
           <w:p>
             <w:pPr>
-              <w:pStyle w:val="Compact"/>
+              <w:pStyle w:val="CompactParagraph"/>
             </w:pPr>
             <w:r>
               <w:t xml:space="preserve">Audience handling</w:t>
@@ -3447,7 +3463,7 @@
           <w:tcPr/>
           <w:p>
             <w:pPr>
-              <w:pStyle w:val="Compact"/>
+              <w:pStyle w:val="CompactParagraph"/>
             </w:pPr>
             <w:r>
               <w:t xml:space="preserve">same file,</w:t>
@@ -3467,7 +3483,7 @@
           <w:tcPr/>
           <w:p>
             <w:pPr>
-              <w:pStyle w:val="Compact"/>
+              <w:pStyle w:val="CompactParagraph"/>
             </w:pPr>
             <w:r>
               <w:t xml:space="preserve">Merges</w:t>
@@ -3504,7 +3520,7 @@
           <w:tcPr/>
           <w:p>
             <w:pPr>
-              <w:pStyle w:val="Compact"/>
+              <w:pStyle w:val="CompactParagraph"/>
             </w:pPr>
             <w:r>
               <w:t xml:space="preserve">Title attach worker</w:t>
@@ -3515,7 +3531,7 @@
           <w:tcPr/>
           <w:p>
             <w:pPr>
-              <w:pStyle w:val="Compact"/>
+              <w:pStyle w:val="CompactParagraph"/>
             </w:pPr>
             <w:r>
               <w:rPr>
@@ -3529,7 +3545,7 @@
           <w:tcPr/>
           <w:p>
             <w:pPr>
-              <w:pStyle w:val="Compact"/>
+              <w:pStyle w:val="CompactParagraph"/>
             </w:pPr>
             <w:r>
               <w:rPr>
@@ -3560,7 +3576,7 @@
           <w:tcPr/>
           <w:p>
             <w:pPr>
-              <w:pStyle w:val="Compact"/>
+              <w:pStyle w:val="CompactParagraph"/>
             </w:pPr>
             <w:r>
               <w:t xml:space="preserve">Install ID resolution</w:t>
@@ -3571,7 +3587,7 @@
           <w:tcPr/>
           <w:p>
             <w:pPr>
-              <w:pStyle w:val="Compact"/>
+              <w:pStyle w:val="CompactParagraph"/>
             </w:pPr>
             <w:r>
               <w:t xml:space="preserve">same file,</w:t>
@@ -3591,7 +3607,7 @@
           <w:tcPr/>
           <w:p>
             <w:pPr>
-              <w:pStyle w:val="Compact"/>
+              <w:pStyle w:val="CompactParagraph"/>
             </w:pPr>
             <w:r>
               <w:rPr>
@@ -3607,7 +3623,7 @@
           <w:tcPr/>
           <w:p>
             <w:pPr>
-              <w:pStyle w:val="Compact"/>
+              <w:pStyle w:val="CompactParagraph"/>
             </w:pPr>
             <w:r>
               <w:t xml:space="preserve">Workflow ingress</w:t>
@@ -3618,7 +3634,7 @@
           <w:tcPr/>
           <w:p>
             <w:pPr>
-              <w:pStyle w:val="Compact"/>
+              <w:pStyle w:val="CompactParagraph"/>
             </w:pPr>
             <w:r>
               <w:rPr>
@@ -3632,7 +3648,7 @@
           <w:tcPr/>
           <w:p>
             <w:pPr>
-              <w:pStyle w:val="Compact"/>
+              <w:pStyle w:val="CompactParagraph"/>
             </w:pPr>
             <w:r>
               <w:rPr>
@@ -3660,7 +3676,7 @@
           <w:tcPr/>
           <w:p>
             <w:pPr>
-              <w:pStyle w:val="Compact"/>
+              <w:pStyle w:val="CompactParagraph"/>
             </w:pPr>
             <w:r>
               <w:t xml:space="preserve">Partner registry integration</w:t>
@@ -3671,7 +3687,7 @@
           <w:tcPr/>
           <w:p>
             <w:pPr>
-              <w:pStyle w:val="Compact"/>
+              <w:pStyle w:val="CompactParagraph"/>
             </w:pPr>
             <w:r>
               <w:rPr>
@@ -3685,7 +3701,7 @@
           <w:tcPr/>
           <w:p>
             <w:pPr>
-              <w:pStyle w:val="Compact"/>
+              <w:pStyle w:val="CompactParagraph"/>
             </w:pPr>
             <w:r>
               <w:rPr>
@@ -3713,7 +3729,7 @@
           <w:tcPr/>
           <w:p>
             <w:pPr>
-              <w:pStyle w:val="Compact"/>
+              <w:pStyle w:val="CompactParagraph"/>
             </w:pPr>
             <w:r>
               <w:t xml:space="preserve">Store change source</w:t>
@@ -3724,7 +3740,7 @@
           <w:tcPr/>
           <w:p>
             <w:pPr>
-              <w:pStyle w:val="Compact"/>
+              <w:pStyle w:val="CompactParagraph"/>
             </w:pPr>
             <w:r>
               <w:rPr>
@@ -3738,7 +3754,7 @@
           <w:tcPr/>
           <w:p>
             <w:pPr>
-              <w:pStyle w:val="Compact"/>
+              <w:pStyle w:val="CompactParagraph"/>
             </w:pPr>
             <w:r>
               <w:t xml:space="preserve">Only BigCat is wired; abstraction is</w:t>
@@ -3770,7 +3786,7 @@
     </w:p>
     <w:p>
       <w:pPr>
-        <w:pStyle w:val="Compact"/>
+        <w:pStyle w:val="CompactParagraph"/>
         <w:numPr>
           <w:ilvl w:val="0"/>
           <w:numId w:val="1004"/>
@@ -3805,7 +3821,7 @@
     </w:p>
     <w:p>
       <w:pPr>
-        <w:pStyle w:val="Compact"/>
+        <w:pStyle w:val="CompactParagraph"/>
         <w:numPr>
           <w:ilvl w:val="0"/>
           <w:numId w:val="1004"/>
@@ -3840,7 +3856,7 @@
     </w:p>
     <w:p>
       <w:pPr>
-        <w:pStyle w:val="Compact"/>
+        <w:pStyle w:val="CompactParagraph"/>
         <w:numPr>
           <w:ilvl w:val="1"/>
           <w:numId w:val="1005"/>
@@ -3870,7 +3886,7 @@
     </w:p>
     <w:p>
       <w:pPr>
-        <w:pStyle w:val="Compact"/>
+        <w:pStyle w:val="CompactParagraph"/>
         <w:numPr>
           <w:ilvl w:val="1"/>
           <w:numId w:val="1005"/>
@@ -3942,7 +3958,7 @@
     </w:p>
     <w:p>
       <w:pPr>
-        <w:pStyle w:val="Compact"/>
+        <w:pStyle w:val="CompactParagraph"/>
         <w:numPr>
           <w:ilvl w:val="1"/>
           <w:numId w:val="1005"/>
@@ -3963,7 +3979,7 @@
     </w:p>
     <w:p>
       <w:pPr>
-        <w:pStyle w:val="Compact"/>
+        <w:pStyle w:val="CompactParagraph"/>
         <w:numPr>
           <w:ilvl w:val="1"/>
           <w:numId w:val="1005"/>
@@ -4032,7 +4048,7 @@
     </w:p>
     <w:p>
       <w:pPr>
-        <w:pStyle w:val="Compact"/>
+        <w:pStyle w:val="CompactParagraph"/>
         <w:numPr>
           <w:ilvl w:val="1"/>
           <w:numId w:val="1005"/>
@@ -4062,7 +4078,7 @@
     </w:p>
     <w:p>
       <w:pPr>
-        <w:pStyle w:val="Compact"/>
+        <w:pStyle w:val="CompactParagraph"/>
         <w:numPr>
           <w:ilvl w:val="1"/>
           <w:numId w:val="1005"/>
@@ -4083,7 +4099,7 @@
     </w:p>
     <w:p>
       <w:pPr>
-        <w:pStyle w:val="Compact"/>
+        <w:pStyle w:val="CompactParagraph"/>
         <w:numPr>
           <w:ilvl w:val="1"/>
           <w:numId w:val="1005"/>
@@ -4128,7 +4144,7 @@
     </w:p>
     <w:p>
       <w:pPr>
-        <w:pStyle w:val="Compact"/>
+        <w:pStyle w:val="CompactParagraph"/>
         <w:numPr>
           <w:ilvl w:val="0"/>
           <w:numId w:val="1004"/>
@@ -4163,7 +4179,7 @@
     </w:p>
     <w:p>
       <w:pPr>
-        <w:pStyle w:val="Compact"/>
+        <w:pStyle w:val="CompactParagraph"/>
         <w:numPr>
           <w:ilvl w:val="0"/>
           <w:numId w:val="1004"/>
@@ -4186,7 +4202,7 @@
     </w:p>
     <w:p>
       <w:pPr>
-        <w:pStyle w:val="Compact"/>
+        <w:pStyle w:val="CompactParagraph"/>
         <w:numPr>
           <w:ilvl w:val="0"/>
           <w:numId w:val="1004"/>
@@ -4236,7 +4252,7 @@
     </w:p>
     <w:p>
       <w:pPr>
-        <w:pStyle w:val="Compact"/>
+        <w:pStyle w:val="CompactParagraph"/>
         <w:numPr>
           <w:ilvl w:val="0"/>
           <w:numId w:val="1004"/>
@@ -4337,7 +4353,7 @@
           <w:tcPr/>
           <w:p>
             <w:pPr>
-              <w:pStyle w:val="Compact"/>
+              <w:pStyle w:val="CompactParagraph"/>
             </w:pPr>
             <w:r>
               <w:t xml:space="preserve">Concept</w:t>
@@ -4348,7 +4364,7 @@
           <w:tcPr/>
           <w:p>
             <w:pPr>
-              <w:pStyle w:val="Compact"/>
+              <w:pStyle w:val="CompactParagraph"/>
             </w:pPr>
             <w:r>
               <w:t xml:space="preserve">File</w:t>
@@ -4359,7 +4375,7 @@
           <w:tcPr/>
           <w:p>
             <w:pPr>
-              <w:pStyle w:val="Compact"/>
+              <w:pStyle w:val="CompactParagraph"/>
             </w:pPr>
             <w:r>
               <w:t xml:space="preserve">Notes</w:t>
@@ -4372,7 +4388,7 @@
           <w:tcPr/>
           <w:p>
             <w:pPr>
-              <w:pStyle w:val="Compact"/>
+              <w:pStyle w:val="CompactParagraph"/>
             </w:pPr>
             <w:r>
               <w:rPr>
@@ -4392,7 +4408,7 @@
           <w:tcPr/>
           <w:p>
             <w:pPr>
-              <w:pStyle w:val="Compact"/>
+              <w:pStyle w:val="CompactParagraph"/>
             </w:pPr>
             <w:r>
               <w:rPr>
@@ -4406,7 +4422,7 @@
           <w:tcPr/>
           <w:p>
             <w:pPr>
-              <w:pStyle w:val="Compact"/>
+              <w:pStyle w:val="CompactParagraph"/>
             </w:pPr>
             <w:r>
               <w:t xml:space="preserve">Has</w:t>
@@ -4443,7 +4459,7 @@
           <w:tcPr/>
           <w:p>
             <w:pPr>
-              <w:pStyle w:val="Compact"/>
+              <w:pStyle w:val="CompactParagraph"/>
             </w:pPr>
             <w:r>
               <w:t xml:space="preserve">Offering id constraint</w:t>
@@ -4454,7 +4470,7 @@
           <w:tcPr/>
           <w:p>
             <w:pPr>
-              <w:pStyle w:val="Compact"/>
+              <w:pStyle w:val="CompactParagraph"/>
             </w:pPr>
             <w:r>
               <w:t xml:space="preserve">same file,</w:t>
@@ -4474,7 +4490,7 @@
           <w:tcPr/>
           <w:p>
             <w:pPr>
-              <w:pStyle w:val="Compact"/>
+              <w:pStyle w:val="CompactParagraph"/>
             </w:pPr>
             <w:r>
               <w:t xml:space="preserve">Max length 32.</w:t>
@@ -4512,7 +4528,7 @@
           <w:tcPr/>
           <w:p>
             <w:pPr>
-              <w:pStyle w:val="Compact"/>
+              <w:pStyle w:val="CompactParagraph"/>
             </w:pPr>
             <w:r>
               <w:t xml:space="preserve">Resource path</w:t>
@@ -4523,7 +4539,7 @@
           <w:tcPr/>
           <w:p>
             <w:pPr>
-              <w:pStyle w:val="Compact"/>
+              <w:pStyle w:val="CompactParagraph"/>
             </w:pPr>
             <w:r>
               <w:t xml:space="preserve">same file,</w:t>
@@ -4543,7 +4559,7 @@
           <w:tcPr/>
           <w:p>
             <w:pPr>
-              <w:pStyle w:val="Compact"/>
+              <w:pStyle w:val="CompactParagraph"/>
             </w:pPr>
             <w:r>
               <w:rPr>
@@ -4559,7 +4575,7 @@
           <w:tcPr/>
           <w:p>
             <w:pPr>
-              <w:pStyle w:val="Compact"/>
+              <w:pStyle w:val="CompactParagraph"/>
             </w:pPr>
             <w:r>
               <w:t xml:space="preserve">Create / upsert route</w:t>
@@ -4570,7 +4586,7 @@
           <w:tcPr/>
           <w:p>
             <w:pPr>
-              <w:pStyle w:val="Compact"/>
+              <w:pStyle w:val="CompactParagraph"/>
             </w:pPr>
             <w:r>
               <w:rPr>
@@ -4584,7 +4600,7 @@
           <w:tcPr/>
           <w:p>
             <w:pPr>
-              <w:pStyle w:val="Compact"/>
+              <w:pStyle w:val="CompactParagraph"/>
             </w:pPr>
             <w:r>
               <w:rPr>
@@ -4600,7 +4616,7 @@
           <w:tcPr/>
           <w:p>
             <w:pPr>
-              <w:pStyle w:val="Compact"/>
+              <w:pStyle w:val="CompactParagraph"/>
             </w:pPr>
             <w:r>
               <w:t xml:space="preserve">Attach single title</w:t>
@@ -4611,7 +4627,7 @@
           <w:tcPr/>
           <w:p>
             <w:pPr>
-              <w:pStyle w:val="Compact"/>
+              <w:pStyle w:val="CompactParagraph"/>
             </w:pPr>
             <w:r>
               <w:t xml:space="preserve">same file,</w:t>
@@ -4631,7 +4647,7 @@
           <w:tcPr/>
           <w:p>
             <w:pPr>
-              <w:pStyle w:val="Compact"/>
+              <w:pStyle w:val="CompactParagraph"/>
             </w:pPr>
             <w:r>
               <w:rPr>
@@ -4647,7 +4663,7 @@
           <w:tcPr/>
           <w:p>
             <w:pPr>
-              <w:pStyle w:val="Compact"/>
+              <w:pStyle w:val="CompactParagraph"/>
             </w:pPr>
             <w:r>
               <w:t xml:space="preserve">Delete offering</w:t>
@@ -4658,7 +4674,7 @@
           <w:tcPr/>
           <w:p>
             <w:pPr>
-              <w:pStyle w:val="Compact"/>
+              <w:pStyle w:val="CompactParagraph"/>
             </w:pPr>
             <w:r>
               <w:t xml:space="preserve">same file,</w:t>
@@ -4678,7 +4694,7 @@
           <w:tcPr/>
           <w:p>
             <w:pPr>
-              <w:pStyle w:val="Compact"/>
+              <w:pStyle w:val="CompactParagraph"/>
             </w:pPr>
             <w:r>
               <w:t xml:space="preserve">Used for teardown</w:t>
@@ -4691,7 +4707,7 @@
           <w:tcPr/>
           <w:p>
             <w:pPr>
-              <w:pStyle w:val="Compact"/>
+              <w:pStyle w:val="CompactParagraph"/>
             </w:pPr>
             <w:r>
               <w:t xml:space="preserve">Storage backend</w:t>
@@ -4702,7 +4718,7 @@
           <w:tcPr/>
           <w:p>
             <w:pPr>
-              <w:pStyle w:val="Compact"/>
+              <w:pStyle w:val="CompactParagraph"/>
             </w:pPr>
             <w:r>
               <w:rPr>
@@ -4716,7 +4732,7 @@
           <w:tcPr/>
           <w:p>
             <w:pPr>
-              <w:pStyle w:val="Compact"/>
+              <w:pStyle w:val="CompactParagraph"/>
             </w:pPr>
             <w:r>
               <w:t xml:space="preserve">Every write becomes an ADO PR via</w:t>
@@ -4738,7 +4754,7 @@
           <w:tcPr/>
           <w:p>
             <w:pPr>
-              <w:pStyle w:val="Compact"/>
+              <w:pStyle w:val="CompactParagraph"/>
             </w:pPr>
             <w:r>
               <w:t xml:space="preserve">Bulk edit (for combining writes)</w:t>
@@ -4749,7 +4765,7 @@
           <w:tcPr/>
           <w:p>
             <w:pPr>
-              <w:pStyle w:val="Compact"/>
+              <w:pStyle w:val="CompactParagraph"/>
             </w:pPr>
             <w:r>
               <w:t xml:space="preserve">same file,</w:t>
@@ -4769,7 +4785,7 @@
           <w:tcPr/>
           <w:p>
             <w:pPr>
-              <w:pStyle w:val="Compact"/>
+              <w:pStyle w:val="CompactParagraph"/>
             </w:pPr>
             <w:r>
               <w:rPr>
@@ -4791,7 +4807,7 @@
           <w:tcPr/>
           <w:p>
             <w:pPr>
-              <w:pStyle w:val="Compact"/>
+              <w:pStyle w:val="CompactParagraph"/>
             </w:pPr>
             <w:r>
               <w:t xml:space="preserve">Runtime read model</w:t>
@@ -4802,7 +4818,7 @@
           <w:tcPr/>
           <w:p>
             <w:pPr>
-              <w:pStyle w:val="Compact"/>
+              <w:pStyle w:val="CompactParagraph"/>
             </w:pPr>
             <w:r>
               <w:rPr>
@@ -4816,7 +4832,7 @@
           <w:tcPr/>
           <w:p>
             <w:pPr>
-              <w:pStyle w:val="Compact"/>
+              <w:pStyle w:val="CompactParagraph"/>
             </w:pPr>
             <w:r>
               <w:t xml:space="preserve">In-memory</w:t>
@@ -4841,7 +4857,7 @@
           <w:tcPr/>
           <w:p>
             <w:pPr>
-              <w:pStyle w:val="Compact"/>
+              <w:pStyle w:val="CompactParagraph"/>
             </w:pPr>
             <w:r>
               <w:t xml:space="preserve">Expiration</w:t>
@@ -4852,7 +4868,7 @@
           <w:tcPr/>
           <w:p>
             <w:pPr>
-              <w:pStyle w:val="Compact"/>
+              <w:pStyle w:val="CompactParagraph"/>
             </w:pPr>
             <w:r>
               <w:rPr>
@@ -4866,7 +4882,7 @@
           <w:tcPr/>
           <w:p>
             <w:pPr>
-              <w:pStyle w:val="Compact"/>
+              <w:pStyle w:val="CompactParagraph"/>
             </w:pPr>
             <w:r>
               <w:t xml:space="preserve">Hourly sweep uses</w:t>
@@ -4888,7 +4904,7 @@
           <w:tcPr/>
           <w:p>
             <w:pPr>
-              <w:pStyle w:val="Compact"/>
+              <w:pStyle w:val="CompactParagraph"/>
             </w:pPr>
             <w:r>
               <w:t xml:space="preserve">Existing auth-options pattern</w:t>
@@ -4899,7 +4915,7 @@
           <w:tcPr/>
           <w:p>
             <w:pPr>
-              <w:pStyle w:val="Compact"/>
+              <w:pStyle w:val="CompactParagraph"/>
             </w:pPr>
             <w:r>
               <w:rPr>
@@ -4913,7 +4929,7 @@
           <w:tcPr/>
           <w:p>
             <w:pPr>
-              <w:pStyle w:val="Compact"/>
+              <w:pStyle w:val="CompactParagraph"/>
             </w:pPr>
             <w:r>
               <w:t xml:space="preserve">Reads</w:t>
@@ -4945,7 +4961,7 @@
     </w:p>
     <w:p>
       <w:pPr>
-        <w:pStyle w:val="Compact"/>
+        <w:pStyle w:val="CompactParagraph"/>
         <w:numPr>
           <w:ilvl w:val="0"/>
           <w:numId w:val="1006"/>
@@ -5031,7 +5047,7 @@
     </w:p>
     <w:p>
       <w:pPr>
-        <w:pStyle w:val="Compact"/>
+        <w:pStyle w:val="CompactParagraph"/>
         <w:numPr>
           <w:ilvl w:val="0"/>
           <w:numId w:val="1006"/>
@@ -5096,7 +5112,7 @@
     </w:p>
     <w:p>
       <w:pPr>
-        <w:pStyle w:val="Compact"/>
+        <w:pStyle w:val="CompactParagraph"/>
         <w:numPr>
           <w:ilvl w:val="0"/>
           <w:numId w:val="1006"/>
@@ -5118,7 +5134,7 @@
     </w:p>
     <w:p>
       <w:pPr>
-        <w:pStyle w:val="Compact"/>
+        <w:pStyle w:val="CompactParagraph"/>
         <w:numPr>
           <w:ilvl w:val="0"/>
           <w:numId w:val="1006"/>
@@ -5191,7 +5207,7 @@
     </w:p>
     <w:p>
       <w:pPr>
-        <w:pStyle w:val="Compact"/>
+        <w:pStyle w:val="CompactParagraph"/>
         <w:numPr>
           <w:ilvl w:val="0"/>
           <w:numId w:val="1006"/>
@@ -5240,7 +5256,7 @@
     </w:p>
     <w:p>
       <w:pPr>
-        <w:pStyle w:val="Compact"/>
+        <w:pStyle w:val="CompactParagraph"/>
         <w:numPr>
           <w:ilvl w:val="0"/>
           <w:numId w:val="1006"/>
@@ -5807,7 +5823,7 @@
           <w:tcPr/>
           <w:p>
             <w:pPr>
-              <w:pStyle w:val="Compact"/>
+              <w:pStyle w:val="CompactParagraph"/>
             </w:pPr>
             <w:r>
               <w:t xml:space="preserve">Field</w:t>
@@ -5818,7 +5834,7 @@
           <w:tcPr/>
           <w:p>
             <w:pPr>
-              <w:pStyle w:val="Compact"/>
+              <w:pStyle w:val="CompactParagraph"/>
             </w:pPr>
             <w:r>
               <w:t xml:space="preserve">Type (actual)</w:t>
@@ -5829,7 +5845,7 @@
           <w:tcPr/>
           <w:p>
             <w:pPr>
-              <w:pStyle w:val="Compact"/>
+              <w:pStyle w:val="CompactParagraph"/>
             </w:pPr>
             <w:r>
               <w:t xml:space="preserve">Source on xPlaytest side</w:t>
@@ -5840,7 +5856,7 @@
           <w:tcPr/>
           <w:p>
             <w:pPr>
-              <w:pStyle w:val="Compact"/>
+              <w:pStyle w:val="CompactParagraph"/>
             </w:pPr>
             <w:r>
               <w:t xml:space="preserve">Notes</w:t>
@@ -5853,7 +5869,7 @@
           <w:tcPr/>
           <w:p>
             <w:pPr>
-              <w:pStyle w:val="Compact"/>
+              <w:pStyle w:val="CompactParagraph"/>
             </w:pPr>
             <w:r>
               <w:rPr>
@@ -5867,7 +5883,7 @@
           <w:tcPr/>
           <w:p>
             <w:pPr>
-              <w:pStyle w:val="Compact"/>
+              <w:pStyle w:val="CompactParagraph"/>
             </w:pPr>
             <w:r>
               <w:rPr>
@@ -5881,7 +5897,7 @@
           <w:tcPr/>
           <w:p>
             <w:pPr>
-              <w:pStyle w:val="Compact"/>
+              <w:pStyle w:val="CompactParagraph"/>
             </w:pPr>
             <w:r>
               <w:rPr>
@@ -5895,7 +5911,7 @@
           <w:tcPr/>
           <w:p>
             <w:pPr>
-              <w:pStyle w:val="Compact"/>
+              <w:pStyle w:val="CompactParagraph"/>
             </w:pPr>
             <w:r>
               <w:t xml:space="preserve">Use the playtest-generated product id, not the retail product id</w:t>
@@ -5908,7 +5924,7 @@
           <w:tcPr/>
           <w:p>
             <w:pPr>
-              <w:pStyle w:val="Compact"/>
+              <w:pStyle w:val="CompactParagraph"/>
             </w:pPr>
             <w:r>
               <w:rPr>
@@ -5922,7 +5938,7 @@
           <w:tcPr/>
           <w:p>
             <w:pPr>
-              <w:pStyle w:val="Compact"/>
+              <w:pStyle w:val="CompactParagraph"/>
             </w:pPr>
             <w:r>
               <w:rPr>
@@ -5936,7 +5952,7 @@
           <w:tcPr/>
           <w:p>
             <w:pPr>
-              <w:pStyle w:val="Compact"/>
+              <w:pStyle w:val="CompactParagraph"/>
             </w:pPr>
             <w:r>
               <w:t xml:space="preserve">Constant</w:t>
@@ -5956,7 +5972,7 @@
           <w:tcPr/>
           <w:p>
             <w:pPr>
-              <w:pStyle w:val="Compact"/>
+              <w:pStyle w:val="CompactParagraph"/>
             </w:pPr>
           </w:p>
         </w:tc>
@@ -5966,7 +5982,7 @@
           <w:tcPr/>
           <w:p>
             <w:pPr>
-              <w:pStyle w:val="Compact"/>
+              <w:pStyle w:val="CompactParagraph"/>
             </w:pPr>
             <w:r>
               <w:rPr>
@@ -5980,7 +5996,7 @@
           <w:tcPr/>
           <w:p>
             <w:pPr>
-              <w:pStyle w:val="Compact"/>
+              <w:pStyle w:val="CompactParagraph"/>
             </w:pPr>
             <w:r>
               <w:rPr>
@@ -5994,7 +6010,7 @@
           <w:tcPr/>
           <w:p>
             <w:pPr>
-              <w:pStyle w:val="Compact"/>
+              <w:pStyle w:val="CompactParagraph"/>
             </w:pPr>
             <w:r>
               <w:rPr>
@@ -6008,7 +6024,7 @@
           <w:tcPr/>
           <w:p>
             <w:pPr>
-              <w:pStyle w:val="Compact"/>
+              <w:pStyle w:val="CompactParagraph"/>
             </w:pPr>
             <w:r>
               <w:rPr>
@@ -6024,7 +6040,7 @@
           <w:tcPr/>
           <w:p>
             <w:pPr>
-              <w:pStyle w:val="Compact"/>
+              <w:pStyle w:val="CompactParagraph"/>
             </w:pPr>
             <w:r>
               <w:rPr>
@@ -6038,7 +6054,7 @@
           <w:tcPr/>
           <w:p>
             <w:pPr>
-              <w:pStyle w:val="Compact"/>
+              <w:pStyle w:val="CompactParagraph"/>
             </w:pPr>
             <w:r>
               <w:rPr>
@@ -6052,7 +6068,7 @@
           <w:tcPr/>
           <w:p>
             <w:pPr>
-              <w:pStyle w:val="Compact"/>
+              <w:pStyle w:val="CompactParagraph"/>
             </w:pPr>
             <w:r>
               <w:rPr>
@@ -6066,7 +6082,7 @@
           <w:tcPr/>
           <w:p>
             <w:pPr>
-              <w:pStyle w:val="Compact"/>
+              <w:pStyle w:val="CompactParagraph"/>
             </w:pPr>
           </w:p>
         </w:tc>
@@ -6076,7 +6092,7 @@
           <w:tcPr/>
           <w:p>
             <w:pPr>
-              <w:pStyle w:val="Compact"/>
+              <w:pStyle w:val="CompactParagraph"/>
             </w:pPr>
             <w:r>
               <w:rPr>
@@ -6090,7 +6106,7 @@
           <w:tcPr/>
           <w:p>
             <w:pPr>
-              <w:pStyle w:val="Compact"/>
+              <w:pStyle w:val="CompactParagraph"/>
             </w:pPr>
             <w:r>
               <w:rPr>
@@ -6104,7 +6120,7 @@
           <w:tcPr/>
           <w:p>
             <w:pPr>
-              <w:pStyle w:val="Compact"/>
+              <w:pStyle w:val="CompactParagraph"/>
             </w:pPr>
             <w:r>
               <w:rPr>
@@ -6118,7 +6134,7 @@
           <w:tcPr/>
           <w:p>
             <w:pPr>
-              <w:pStyle w:val="Compact"/>
+              <w:pStyle w:val="CompactParagraph"/>
             </w:pPr>
           </w:p>
         </w:tc>
@@ -6128,7 +6144,7 @@
           <w:tcPr/>
           <w:p>
             <w:pPr>
-              <w:pStyle w:val="Compact"/>
+              <w:pStyle w:val="CompactParagraph"/>
             </w:pPr>
             <w:r>
               <w:rPr>
@@ -6142,7 +6158,7 @@
           <w:tcPr/>
           <w:p>
             <w:pPr>
-              <w:pStyle w:val="Compact"/>
+              <w:pStyle w:val="CompactParagraph"/>
             </w:pPr>
             <w:r>
               <w:rPr>
@@ -6156,7 +6172,7 @@
           <w:tcPr/>
           <w:p>
             <w:pPr>
-              <w:pStyle w:val="Compact"/>
+              <w:pStyle w:val="CompactParagraph"/>
             </w:pPr>
             <w:r>
               <w:rPr>
@@ -6170,7 +6186,7 @@
           <w:tcPr/>
           <w:p>
             <w:pPr>
-              <w:pStyle w:val="Compact"/>
+              <w:pStyle w:val="CompactParagraph"/>
             </w:pPr>
           </w:p>
         </w:tc>
@@ -6180,7 +6196,7 @@
           <w:tcPr/>
           <w:p>
             <w:pPr>
-              <w:pStyle w:val="Compact"/>
+              <w:pStyle w:val="CompactParagraph"/>
             </w:pPr>
             <w:r>
               <w:rPr>
@@ -6194,7 +6210,7 @@
           <w:tcPr/>
           <w:p>
             <w:pPr>
-              <w:pStyle w:val="Compact"/>
+              <w:pStyle w:val="CompactParagraph"/>
             </w:pPr>
             <w:r>
               <w:rPr>
@@ -6208,7 +6224,7 @@
           <w:tcPr/>
           <w:p>
             <w:pPr>
-              <w:pStyle w:val="Compact"/>
+              <w:pStyle w:val="CompactParagraph"/>
             </w:pPr>
             <w:r>
               <w:rPr>
@@ -6222,7 +6238,7 @@
           <w:tcPr/>
           <w:p>
             <w:pPr>
-              <w:pStyle w:val="Compact"/>
+              <w:pStyle w:val="CompactParagraph"/>
             </w:pPr>
           </w:p>
         </w:tc>
@@ -6232,7 +6248,7 @@
           <w:tcPr/>
           <w:p>
             <w:pPr>
-              <w:pStyle w:val="Compact"/>
+              <w:pStyle w:val="CompactParagraph"/>
             </w:pPr>
             <w:r>
               <w:rPr>
@@ -6246,7 +6262,7 @@
           <w:tcPr/>
           <w:p>
             <w:pPr>
-              <w:pStyle w:val="Compact"/>
+              <w:pStyle w:val="CompactParagraph"/>
             </w:pPr>
             <w:r>
               <w:rPr>
@@ -6260,7 +6276,7 @@
           <w:tcPr/>
           <w:p>
             <w:pPr>
-              <w:pStyle w:val="Compact"/>
+              <w:pStyle w:val="CompactParagraph"/>
             </w:pPr>
             <w:r>
               <w:rPr>
@@ -6274,7 +6290,7 @@
           <w:tcPr/>
           <w:p>
             <w:pPr>
-              <w:pStyle w:val="Compact"/>
+              <w:pStyle w:val="CompactParagraph"/>
             </w:pPr>
             <w:r>
               <w:t xml:space="preserve">At least 1 required by validator</w:t>
@@ -6287,7 +6303,7 @@
           <w:tcPr/>
           <w:p>
             <w:pPr>
-              <w:pStyle w:val="Compact"/>
+              <w:pStyle w:val="CompactParagraph"/>
             </w:pPr>
             <w:r>
               <w:rPr>
@@ -6301,7 +6317,7 @@
           <w:tcPr/>
           <w:p>
             <w:pPr>
-              <w:pStyle w:val="Compact"/>
+              <w:pStyle w:val="CompactParagraph"/>
             </w:pPr>
             <w:r>
               <w:rPr>
@@ -6315,7 +6331,7 @@
           <w:tcPr/>
           <w:p>
             <w:pPr>
-              <w:pStyle w:val="Compact"/>
+              <w:pStyle w:val="CompactParagraph"/>
             </w:pPr>
             <w:r>
               <w:rPr>
@@ -6329,7 +6345,7 @@
           <w:tcPr/>
           <w:p>
             <w:pPr>
-              <w:pStyle w:val="Compact"/>
+              <w:pStyle w:val="CompactParagraph"/>
             </w:pPr>
             <w:r>
               <w:t xml:space="preserve">Validator accepts only</w:t>
@@ -6366,7 +6382,7 @@
           <w:tcPr/>
           <w:p>
             <w:pPr>
-              <w:pStyle w:val="Compact"/>
+              <w:pStyle w:val="CompactParagraph"/>
             </w:pPr>
             <w:r>
               <w:rPr>
@@ -6380,7 +6396,7 @@
           <w:tcPr/>
           <w:p>
             <w:pPr>
-              <w:pStyle w:val="Compact"/>
+              <w:pStyle w:val="CompactParagraph"/>
             </w:pPr>
             <w:r>
               <w:rPr>
@@ -6394,7 +6410,7 @@
           <w:tcPr/>
           <w:p>
             <w:pPr>
-              <w:pStyle w:val="Compact"/>
+              <w:pStyle w:val="CompactParagraph"/>
             </w:pPr>
             <w:r>
               <w:rPr>
@@ -6408,7 +6424,7 @@
           <w:tcPr/>
           <w:p>
             <w:pPr>
-              <w:pStyle w:val="Compact"/>
+              <w:pStyle w:val="CompactParagraph"/>
             </w:pPr>
           </w:p>
         </w:tc>
@@ -6418,7 +6434,7 @@
           <w:tcPr/>
           <w:p>
             <w:pPr>
-              <w:pStyle w:val="Compact"/>
+              <w:pStyle w:val="CompactParagraph"/>
             </w:pPr>
             <w:r>
               <w:rPr>
@@ -6432,7 +6448,7 @@
           <w:tcPr/>
           <w:p>
             <w:pPr>
-              <w:pStyle w:val="Compact"/>
+              <w:pStyle w:val="CompactParagraph"/>
             </w:pPr>
             <w:r>
               <w:rPr>
@@ -6446,7 +6462,7 @@
           <w:tcPr/>
           <w:p>
             <w:pPr>
-              <w:pStyle w:val="Compact"/>
+              <w:pStyle w:val="CompactParagraph"/>
             </w:pPr>
             <w:r>
               <w:rPr>
@@ -6491,7 +6507,7 @@
           <w:tcPr/>
           <w:p>
             <w:pPr>
-              <w:pStyle w:val="Compact"/>
+              <w:pStyle w:val="CompactParagraph"/>
             </w:pPr>
             <w:r>
               <w:rPr>
@@ -6529,7 +6545,7 @@
           <w:tcPr/>
           <w:p>
             <w:pPr>
-              <w:pStyle w:val="Compact"/>
+              <w:pStyle w:val="CompactParagraph"/>
             </w:pPr>
             <w:r>
               <w:rPr>
@@ -6543,7 +6559,7 @@
           <w:tcPr/>
           <w:p>
             <w:pPr>
-              <w:pStyle w:val="Compact"/>
+              <w:pStyle w:val="CompactParagraph"/>
             </w:pPr>
             <w:r>
               <w:rPr>
@@ -6557,7 +6573,7 @@
           <w:tcPr/>
           <w:p>
             <w:pPr>
-              <w:pStyle w:val="Compact"/>
+              <w:pStyle w:val="CompactParagraph"/>
             </w:pPr>
             <w:r>
               <w:rPr>
@@ -6571,7 +6587,7 @@
           <w:tcPr/>
           <w:p>
             <w:pPr>
-              <w:pStyle w:val="Compact"/>
+              <w:pStyle w:val="CompactParagraph"/>
             </w:pPr>
             <w:r>
               <w:t xml:space="preserve">Required for PC by validator</w:t>
@@ -6584,7 +6600,7 @@
           <w:tcPr/>
           <w:p>
             <w:pPr>
-              <w:pStyle w:val="Compact"/>
+              <w:pStyle w:val="CompactParagraph"/>
             </w:pPr>
             <w:r>
               <w:rPr>
@@ -6598,7 +6614,7 @@
           <w:tcPr/>
           <w:p>
             <w:pPr>
-              <w:pStyle w:val="Compact"/>
+              <w:pStyle w:val="CompactParagraph"/>
             </w:pPr>
             <w:r>
               <w:rPr>
@@ -6612,7 +6628,7 @@
           <w:tcPr/>
           <w:p>
             <w:pPr>
-              <w:pStyle w:val="Compact"/>
+              <w:pStyle w:val="CompactParagraph"/>
             </w:pPr>
             <w:r>
               <w:rPr>
@@ -6663,7 +6679,7 @@
           <w:tcPr/>
           <w:p>
             <w:pPr>
-              <w:pStyle w:val="Compact"/>
+              <w:pStyle w:val="CompactParagraph"/>
             </w:pPr>
             <w:r>
               <w:rPr>
@@ -6800,7 +6816,7 @@
           <w:tcPr/>
           <w:p>
             <w:pPr>
-              <w:pStyle w:val="Compact"/>
+              <w:pStyle w:val="CompactParagraph"/>
             </w:pPr>
             <w:r>
               <w:t xml:space="preserve">Field</w:t>
@@ -6811,7 +6827,7 @@
           <w:tcPr/>
           <w:p>
             <w:pPr>
-              <w:pStyle w:val="Compact"/>
+              <w:pStyle w:val="CompactParagraph"/>
             </w:pPr>
             <w:r>
               <w:t xml:space="preserve">Computation</w:t>
@@ -6824,7 +6840,7 @@
           <w:tcPr/>
           <w:p>
             <w:pPr>
-              <w:pStyle w:val="Compact"/>
+              <w:pStyle w:val="CompactParagraph"/>
             </w:pPr>
             <w:r>
               <w:rPr>
@@ -6838,7 +6854,7 @@
           <w:tcPr/>
           <w:p>
             <w:pPr>
-              <w:pStyle w:val="Compact"/>
+              <w:pStyle w:val="CompactParagraph"/>
             </w:pPr>
             <w:r>
               <w:t xml:space="preserve">Constant</w:t>
@@ -6860,7 +6876,7 @@
           <w:tcPr/>
           <w:p>
             <w:pPr>
-              <w:pStyle w:val="Compact"/>
+              <w:pStyle w:val="CompactParagraph"/>
             </w:pPr>
             <w:r>
               <w:rPr>
@@ -6874,7 +6890,7 @@
           <w:tcPr/>
           <w:p>
             <w:pPr>
-              <w:pStyle w:val="Compact"/>
+              <w:pStyle w:val="CompactParagraph"/>
             </w:pPr>
             <w:r>
               <w:rPr>
@@ -6893,7 +6909,7 @@
           <w:tcPr/>
           <w:p>
             <w:pPr>
-              <w:pStyle w:val="Compact"/>
+              <w:pStyle w:val="CompactParagraph"/>
             </w:pPr>
             <w:r>
               <w:rPr>
@@ -6907,7 +6923,7 @@
           <w:tcPr/>
           <w:p>
             <w:pPr>
-              <w:pStyle w:val="Compact"/>
+              <w:pStyle w:val="CompactParagraph"/>
             </w:pPr>
             <w:r>
               <w:t xml:space="preserve">Same as</w:t>
@@ -6950,7 +6966,7 @@
           <w:tcPr/>
           <w:p>
             <w:pPr>
-              <w:pStyle w:val="Compact"/>
+              <w:pStyle w:val="CompactParagraph"/>
             </w:pPr>
             <w:r>
               <w:rPr>
@@ -6964,7 +6980,7 @@
           <w:tcPr/>
           <w:p>
             <w:pPr>
-              <w:pStyle w:val="Compact"/>
+              <w:pStyle w:val="CompactParagraph"/>
             </w:pPr>
             <w:r>
               <w:rPr>
@@ -6980,7 +6996,7 @@
           <w:tcPr/>
           <w:p>
             <w:pPr>
-              <w:pStyle w:val="Compact"/>
+              <w:pStyle w:val="CompactParagraph"/>
             </w:pPr>
             <w:r>
               <w:rPr>
@@ -6994,7 +7010,7 @@
           <w:tcPr/>
           <w:p>
             <w:pPr>
-              <w:pStyle w:val="Compact"/>
+              <w:pStyle w:val="CompactParagraph"/>
             </w:pPr>
             <w:r>
               <w:rPr>
@@ -7010,7 +7026,7 @@
           <w:tcPr/>
           <w:p>
             <w:pPr>
-              <w:pStyle w:val="Compact"/>
+              <w:pStyle w:val="CompactParagraph"/>
             </w:pPr>
             <w:r>
               <w:rPr>
@@ -7024,7 +7040,7 @@
           <w:tcPr/>
           <w:p>
             <w:pPr>
-              <w:pStyle w:val="Compact"/>
+              <w:pStyle w:val="CompactParagraph"/>
             </w:pPr>
             <w:r>
               <w:rPr>
@@ -7040,7 +7056,7 @@
           <w:tcPr/>
           <w:p>
             <w:pPr>
-              <w:pStyle w:val="Compact"/>
+              <w:pStyle w:val="CompactParagraph"/>
             </w:pPr>
             <w:r>
               <w:rPr>
@@ -7054,7 +7070,7 @@
           <w:tcPr/>
           <w:p>
             <w:pPr>
-              <w:pStyle w:val="Compact"/>
+              <w:pStyle w:val="CompactParagraph"/>
             </w:pPr>
             <w:r>
               <w:t xml:space="preserve">Generated by</w:t>
@@ -7091,7 +7107,7 @@
           <w:tcPr/>
           <w:p>
             <w:pPr>
-              <w:pStyle w:val="Compact"/>
+              <w:pStyle w:val="CompactParagraph"/>
             </w:pPr>
             <w:r>
               <w:rPr>
@@ -7105,7 +7121,7 @@
           <w:tcPr/>
           <w:p>
             <w:pPr>
-              <w:pStyle w:val="Compact"/>
+              <w:pStyle w:val="CompactParagraph"/>
             </w:pPr>
             <w:r>
               <w:t xml:space="preserve">Generated by child</w:t>
@@ -7157,7 +7173,7 @@
           <w:tcPr/>
           <w:p>
             <w:pPr>
-              <w:pStyle w:val="Compact"/>
+              <w:pStyle w:val="CompactParagraph"/>
             </w:pPr>
             <w:r>
               <w:rPr>
@@ -7171,7 +7187,7 @@
           <w:tcPr/>
           <w:p>
             <w:pPr>
-              <w:pStyle w:val="Compact"/>
+              <w:pStyle w:val="CompactParagraph"/>
             </w:pPr>
             <w:r>
               <w:rPr>
@@ -7202,7 +7218,7 @@
           <w:tcPr/>
           <w:p>
             <w:pPr>
-              <w:pStyle w:val="Compact"/>
+              <w:pStyle w:val="CompactParagraph"/>
             </w:pPr>
             <w:r>
               <w:t xml:space="preserve">Effective flight ID for SUCU lookup</w:t>
@@ -7213,7 +7229,7 @@
           <w:tcPr/>
           <w:p>
             <w:pPr>
-              <w:pStyle w:val="Compact"/>
+              <w:pStyle w:val="CompactParagraph"/>
             </w:pPr>
             <w:r>
               <w:t xml:space="preserve">Lexicographically smallest</w:t>
@@ -8306,7 +8322,7 @@
     </w:p>
     <w:p>
       <w:pPr>
-        <w:pStyle w:val="Compact"/>
+        <w:pStyle w:val="CompactParagraph"/>
         <w:numPr>
           <w:ilvl w:val="0"/>
           <w:numId w:val="1007"/>
@@ -8370,7 +8386,7 @@
     </w:p>
     <w:p>
       <w:pPr>
-        <w:pStyle w:val="Compact"/>
+        <w:pStyle w:val="CompactParagraph"/>
         <w:numPr>
           <w:ilvl w:val="0"/>
           <w:numId w:val="1008"/>
@@ -8407,7 +8423,7 @@
     </w:p>
     <w:p>
       <w:pPr>
-        <w:pStyle w:val="Compact"/>
+        <w:pStyle w:val="CompactParagraph"/>
         <w:numPr>
           <w:ilvl w:val="0"/>
           <w:numId w:val="1009"/>
@@ -8445,7 +8461,7 @@
     </w:p>
     <w:p>
       <w:pPr>
-        <w:pStyle w:val="Compact"/>
+        <w:pStyle w:val="CompactParagraph"/>
         <w:numPr>
           <w:ilvl w:val="0"/>
           <w:numId w:val="1010"/>
@@ -8491,7 +8507,7 @@
     </w:p>
     <w:p>
       <w:pPr>
-        <w:pStyle w:val="Compact"/>
+        <w:pStyle w:val="CompactParagraph"/>
         <w:numPr>
           <w:ilvl w:val="0"/>
           <w:numId w:val="1011"/>
@@ -8513,7 +8529,7 @@
     </w:p>
     <w:p>
       <w:pPr>
-        <w:pStyle w:val="Compact"/>
+        <w:pStyle w:val="CompactParagraph"/>
         <w:numPr>
           <w:ilvl w:val="0"/>
           <w:numId w:val="1012"/>
@@ -8565,7 +8581,7 @@
     </w:p>
     <w:p>
       <w:pPr>
-        <w:pStyle w:val="Compact"/>
+        <w:pStyle w:val="CompactParagraph"/>
         <w:numPr>
           <w:ilvl w:val="0"/>
           <w:numId w:val="1013"/>
@@ -8602,7 +8618,7 @@
     </w:p>
     <w:p>
       <w:pPr>
-        <w:pStyle w:val="Compact"/>
+        <w:pStyle w:val="CompactParagraph"/>
         <w:numPr>
           <w:ilvl w:val="0"/>
           <w:numId w:val="1014"/>
@@ -8654,7 +8670,7 @@
     </w:p>
     <w:p>
       <w:pPr>
-        <w:pStyle w:val="Compact"/>
+        <w:pStyle w:val="CompactParagraph"/>
         <w:numPr>
           <w:ilvl w:val="0"/>
           <w:numId w:val="1015"/>
@@ -8691,7 +8707,7 @@
     </w:p>
     <w:p>
       <w:pPr>
-        <w:pStyle w:val="Compact"/>
+        <w:pStyle w:val="CompactParagraph"/>
         <w:numPr>
           <w:ilvl w:val="0"/>
           <w:numId w:val="1016"/>
@@ -8730,7 +8746,7 @@
     </w:p>
     <w:p>
       <w:pPr>
-        <w:pStyle w:val="Compact"/>
+        <w:pStyle w:val="CompactParagraph"/>
         <w:numPr>
           <w:ilvl w:val="0"/>
           <w:numId w:val="1017"/>
@@ -8752,7 +8768,7 @@
     </w:p>
     <w:p>
       <w:pPr>
-        <w:pStyle w:val="Compact"/>
+        <w:pStyle w:val="CompactParagraph"/>
         <w:numPr>
           <w:ilvl w:val="0"/>
           <w:numId w:val="1017"/>
@@ -8774,7 +8790,7 @@
     </w:p>
     <w:p>
       <w:pPr>
-        <w:pStyle w:val="Compact"/>
+        <w:pStyle w:val="CompactParagraph"/>
         <w:numPr>
           <w:ilvl w:val="0"/>
           <w:numId w:val="1017"/>
@@ -8796,7 +8812,7 @@
     </w:p>
     <w:p>
       <w:pPr>
-        <w:pStyle w:val="Compact"/>
+        <w:pStyle w:val="CompactParagraph"/>
         <w:numPr>
           <w:ilvl w:val="0"/>
           <w:numId w:val="1017"/>
@@ -8818,7 +8834,7 @@
     </w:p>
     <w:p>
       <w:pPr>
-        <w:pStyle w:val="Compact"/>
+        <w:pStyle w:val="CompactParagraph"/>
         <w:numPr>
           <w:ilvl w:val="0"/>
           <w:numId w:val="1017"/>
@@ -8904,7 +8920,7 @@
           <w:tcPr/>
           <w:p>
             <w:pPr>
-              <w:pStyle w:val="Compact"/>
+              <w:pStyle w:val="CompactParagraph"/>
             </w:pPr>
             <w:r>
               <w:t xml:space="preserve">Repo</w:t>
@@ -8915,7 +8931,7 @@
           <w:tcPr/>
           <w:p>
             <w:pPr>
-              <w:pStyle w:val="Compact"/>
+              <w:pStyle w:val="CompactParagraph"/>
             </w:pPr>
             <w:r>
               <w:t xml:space="preserve">Path</w:t>
@@ -8928,7 +8944,7 @@
           <w:tcPr/>
           <w:p>
             <w:pPr>
-              <w:pStyle w:val="Compact"/>
+              <w:pStyle w:val="CompactParagraph"/>
             </w:pPr>
             <w:r>
               <w:t xml:space="preserve">xPlaytest</w:t>
@@ -8939,7 +8955,7 @@
           <w:tcPr/>
           <w:p>
             <w:pPr>
-              <w:pStyle w:val="Compact"/>
+              <w:pStyle w:val="CompactParagraph"/>
             </w:pPr>
             <w:r>
               <w:rPr>
@@ -8955,7 +8971,7 @@
           <w:tcPr/>
           <w:p>
             <w:pPr>
-              <w:pStyle w:val="Compact"/>
+              <w:pStyle w:val="CompactParagraph"/>
             </w:pPr>
             <w:r>
               <w:t xml:space="preserve">Content Ingestion</w:t>
@@ -8966,7 +8982,7 @@
           <w:tcPr/>
           <w:p>
             <w:pPr>
-              <w:pStyle w:val="Compact"/>
+              <w:pStyle w:val="CompactParagraph"/>
             </w:pPr>
             <w:r>
               <w:rPr>
@@ -8982,7 +8998,7 @@
           <w:tcPr/>
           <w:p>
             <w:pPr>
-              <w:pStyle w:val="Compact"/>
+              <w:pStyle w:val="CompactParagraph"/>
             </w:pPr>
             <w:r>
               <w:t xml:space="preserve">SAGE</w:t>
@@ -8993,7 +9009,7 @@
           <w:tcPr/>
           <w:p>
             <w:pPr>
-              <w:pStyle w:val="Compact"/>
+              <w:pStyle w:val="CompactParagraph"/>
             </w:pPr>
             <w:r>
               <w:rPr>
@@ -9009,7 +9025,7 @@
           <w:tcPr/>
           <w:p>
             <w:pPr>
-              <w:pStyle w:val="Compact"/>
+              <w:pStyle w:val="CompactParagraph"/>
             </w:pPr>
             <w:r>
               <w:t xml:space="preserve">Partner Registry</w:t>
@@ -9020,7 +9036,7 @@
           <w:tcPr/>
           <w:p>
             <w:pPr>
-              <w:pStyle w:val="Compact"/>
+              <w:pStyle w:val="CompactParagraph"/>
             </w:pPr>
             <w:r>
               <w:rPr>
@@ -9035,6 +9051,8 @@
     <w:bookmarkEnd w:id="31"/>
     <w:bookmarkEnd w:id="32"/>
     <w:sectPr>
+      <w:headerReference r:id="rIdHdr1" w:type="default"/>
+      <w:footerReference r:id="rIdFtr1" w:type="default"/>
       <w:footnotePr>
         <w:numRestart w:val="eachSect"/>
       </w:footnotePr>
@@ -9047,6 +9065,46 @@
 <w:comments xmlns:w="http://schemas.openxmlformats.org/wordprocessingml/2006/main" xmlns:m="http://schemas.openxmlformats.org/officeDocument/2006/math" xmlns:r="http://schemas.openxmlformats.org/officeDocument/2006/relationships" xmlns:o="urn:schemas-microsoft-com:office:office" xmlns:v="urn:schemas-microsoft-com:vml" xmlns:w10="urn:schemas-microsoft-com:office:word" xmlns:a="http://schemas.openxmlformats.org/drawingml/2006/main" xmlns:pic="http://schemas.openxmlformats.org/drawingml/2006/picture" xmlns:wp="http://schemas.openxmlformats.org/drawingml/2006/wordprocessingDrawing"/>
 </file>
 
+<file path=word/footer1.xml><?xml version="1.0" encoding="utf-8"?>
+<w:ftr xmlns:w="http://schemas.openxmlformats.org/wordprocessingml/2006/main">
+  <w:p>
+    <w:pPr>
+      <w:pStyle w:val="Footer"/>
+    </w:pPr>
+    <w:r>
+      <w:t xml:space="preserve">Melanie Chen · Draft v2 · 2026-06-03</w:t>
+    </w:r>
+    <w:r>
+      <w:tab/>
+    </w:r>
+    <w:r>
+      <w:t xml:space="preserve">Page </w:t>
+    </w:r>
+    <w:r>
+      <w:fldChar w:fldCharType="begin"/>
+    </w:r>
+    <w:r>
+      <w:instrText xml:space="preserve"> PAGE </w:instrText>
+    </w:r>
+    <w:r>
+      <w:fldChar w:fldCharType="end"/>
+    </w:r>
+    <w:r>
+      <w:t xml:space="preserve"> of </w:t>
+    </w:r>
+    <w:r>
+      <w:fldChar w:fldCharType="begin"/>
+    </w:r>
+    <w:r>
+      <w:instrText xml:space="preserve"> NUMPAGES </w:instrText>
+    </w:r>
+    <w:r>
+      <w:fldChar w:fldCharType="end"/>
+    </w:r>
+  </w:p>
+</w:ftr>
+</file>
+
 <file path=word/footnotes.xml><?xml version="1.0" encoding="utf-8"?>
 <w:footnotes xmlns:w="http://schemas.openxmlformats.org/wordprocessingml/2006/main" xmlns:m="http://schemas.openxmlformats.org/officeDocument/2006/math" xmlns:r="http://schemas.openxmlformats.org/officeDocument/2006/relationships" xmlns:o="urn:schemas-microsoft-com:office:office" xmlns:v="urn:schemas-microsoft-com:vml" xmlns:w10="urn:schemas-microsoft-com:office:word" xmlns:a="http://schemas.openxmlformats.org/drawingml/2006/main" xmlns:pic="http://schemas.openxmlformats.org/drawingml/2006/picture" xmlns:wp="http://schemas.openxmlformats.org/drawingml/2006/wordprocessingDrawing">
   <w:footnote w:type="continuationSeparator" w:id="0">
@@ -9064,6 +9122,25 @@
     </w:p>
   </w:footnote>
 </w:footnotes>
+</file>
+
+<file path=word/header1.xml><?xml version="1.0" encoding="utf-8"?>
+<w:hdr xmlns:w="http://schemas.openxmlformats.org/wordprocessingml/2006/main">
+  <w:p>
+    <w:pPr>
+      <w:pStyle w:val="Header"/>
+    </w:pPr>
+    <w:r>
+      <w:t>Instantly Shareable Playtest — Implementation Spec</w:t>
+    </w:r>
+    <w:r>
+      <w:tab/>
+    </w:r>
+    <w:r>
+      <w:t>Confidential · Microsoft Gaming</w:t>
+    </w:r>
+  </w:p>
+</w:hdr>
 </file>
 
 <file path=word/numbering.xml><?xml version="1.0" encoding="utf-8"?>
@@ -9574,544 +9651,344 @@
 </file>
 
 <file path=word/styles.xml><?xml version="1.0" encoding="utf-8"?>
-<w:styles xmlns:r="http://schemas.openxmlformats.org/officeDocument/2006/relationships" xmlns:w="http://schemas.openxmlformats.org/wordprocessingml/2006/main">
+<w:styles xmlns:w="http://schemas.openxmlformats.org/wordprocessingml/2006/main">
   <w:docDefaults>
     <w:rPrDefault>
       <w:rPr>
-        <w:rFonts w:asciiTheme="minorHAnsi" w:cstheme="minorBidi" w:eastAsiaTheme="minorEastAsia" w:hAnsiTheme="minorHAnsi"/>
-        <w:sz w:val="24"/>
-        <w:szCs w:val="24"/>
-        <w:lang w:bidi="ar-SA" w:eastAsia="zh-CN" w:val="en-US"/>
+        <w:rFonts w:ascii="Segoe UI" w:cs="Segoe UI" w:hAnsi="Segoe UI"/>
+        <w:sz w:val="22"/>
+        <w:szCs w:val="22"/>
+        <w:lang w:val="en-US"/>
       </w:rPr>
     </w:rPrDefault>
     <w:pPrDefault>
       <w:pPr>
-        <w:spacing w:after="200"/>
+        <w:spacing w:after="120" w:line="288" w:lineRule="auto"/>
       </w:pPr>
     </w:pPrDefault>
   </w:docDefaults>
-  <w:latentStyles w:count="276" w:defLockedState="0" w:defQFormat="0" w:defSemiHidden="0" w:defUIPriority="0" w:defUnhideWhenUsed="0"/>
   <w:style w:default="1" w:styleId="Normal" w:type="paragraph">
     <w:name w:val="Normal"/>
     <w:qFormat/>
   </w:style>
-  <w:style w:styleId="BodyText" w:type="paragraph">
-    <w:name w:val="Body Text"/>
-    <w:basedOn w:val="Normal"/>
-    <w:link w:val="BodyTextChar"/>
-    <w:qFormat/>
-    <w:pPr>
-      <w:spacing w:after="180" w:before="180"/>
-    </w:pPr>
-  </w:style>
-  <w:style w:customStyle="1" w:styleId="FirstParagraph" w:type="paragraph">
-    <w:name w:val="First Paragraph"/>
-    <w:basedOn w:val="BodyText"/>
-    <w:next w:val="BodyText"/>
-    <w:qFormat/>
-  </w:style>
-  <w:style w:customStyle="1" w:styleId="Compact" w:type="paragraph">
-    <w:name w:val="Compact"/>
-    <w:basedOn w:val="BodyText"/>
-    <w:qFormat/>
-    <w:pPr>
-      <w:spacing w:after="36" w:before="36"/>
-    </w:pPr>
-  </w:style>
   <w:style w:styleId="Title" w:type="paragraph">
     <w:name w:val="Title"/>
     <w:basedOn w:val="Normal"/>
-    <w:next w:val="BodyText"/>
-    <w:link w:val="TitleChar"/>
-    <w:uiPriority w:val="10"/>
+    <w:next w:val="Normal"/>
     <w:qFormat/>
-    <w:rsid w:val="00A10FD9"/>
     <w:pPr>
-      <w:spacing w:after="80" w:line="240" w:lineRule="auto"/>
+      <w:spacing w:after="240" w:before="3600"/>
+      <w:jc w:val="center"/>
       <w:contextualSpacing/>
-      <w:jc w:val="center"/>
     </w:pPr>
     <w:rPr>
-      <w:rFonts w:asciiTheme="majorHAnsi" w:cstheme="majorBidi" w:eastAsiaTheme="majorEastAsia" w:hAnsiTheme="majorHAnsi"/>
-      <w:sz w:val="56"/>
-      <w:szCs w:val="56"/>
-    </w:rPr>
-  </w:style>
-  <w:style w:customStyle="1" w:styleId="TitleChar" w:type="character">
-    <w:name w:val="Title Char"/>
-    <w:basedOn w:val="DefaultParagraphFont"/>
-    <w:link w:val="Title"/>
-    <w:uiPriority w:val="10"/>
-    <w:rsid w:val="00A10FD9"/>
-    <w:rPr>
-      <w:rFonts w:asciiTheme="majorHAnsi" w:cstheme="majorBidi" w:eastAsiaTheme="majorEastAsia" w:hAnsiTheme="majorHAnsi"/>
-      <w:sz w:val="56"/>
-      <w:szCs w:val="56"/>
+      <w:rFonts w:ascii="Segoe UI Light" w:hAnsi="Segoe UI Light"/>
+      <w:color w:val="0F6CBD"/>
+      <w:sz w:val="64"/>
+      <w:szCs w:val="64"/>
     </w:rPr>
   </w:style>
   <w:style w:styleId="Subtitle" w:type="paragraph">
     <w:name w:val="Subtitle"/>
-    <w:basedOn w:val="Title"/>
-    <w:next w:val="BodyText"/>
-    <w:link w:val="SubtitleChar"/>
-    <w:uiPriority w:val="11"/>
+    <w:basedOn w:val="Normal"/>
+    <w:next w:val="Normal"/>
     <w:qFormat/>
-    <w:rsid w:val="00A10FD9"/>
     <w:pPr>
-      <w:numPr>
-        <w:ilvl w:val="1"/>
-      </w:numPr>
+      <w:spacing w:after="480" w:before="0"/>
+      <w:jc w:val="center"/>
+      <w:pBdr>
+        <w:bottom w:color="0F6CBD" w:space="8" w:sz="12" w:val="single"/>
+      </w:pBdr>
     </w:pPr>
     <w:rPr>
-      <w:rFonts w:cstheme="majorBidi" w:eastAsiaTheme="majorEastAsia"/>
-      <w:spacing w:val="15"/>
+      <w:rFonts w:ascii="Segoe UI" w:hAnsi="Segoe UI"/>
+      <w:color w:val="595959"/>
       <w:sz w:val="28"/>
       <w:szCs w:val="28"/>
+      <w:i/>
     </w:rPr>
   </w:style>
-  <w:style w:customStyle="1" w:styleId="SubtitleChar" w:type="character">
-    <w:name w:val="Subtitle Char"/>
-    <w:basedOn w:val="DefaultParagraphFont"/>
-    <w:link w:val="Subtitle"/>
-    <w:uiPriority w:val="11"/>
-    <w:rsid w:val="00A10FD9"/>
-    <w:rPr>
-      <w:rFonts w:cstheme="majorBidi" w:eastAsiaTheme="majorEastAsia"/>
-      <w:color w:themeColor="text1" w:themeTint="A6" w:val="595959"/>
-      <w:spacing w:val="15"/>
-      <w:sz w:val="28"/>
-      <w:szCs w:val="28"/>
-    </w:rPr>
-  </w:style>
-  <w:style w:customStyle="1" w:styleId="Author" w:type="paragraph">
+  <w:style w:styleId="Author" w:type="paragraph">
     <w:name w:val="Author"/>
-    <w:basedOn w:val="Title"/>
-    <w:next w:val="BodyText"/>
+    <w:basedOn w:val="Normal"/>
+    <w:next w:val="Normal"/>
     <w:qFormat/>
     <w:pPr>
-      <w:keepNext/>
-      <w:keepLines/>
+      <w:spacing w:after="0" w:before="120"/>
+      <w:jc w:val="center"/>
     </w:pPr>
     <w:rPr>
+      <w:rFonts w:ascii="Segoe UI Semibold" w:hAnsi="Segoe UI Semibold"/>
+      <w:color w:val="404040"/>
       <w:sz w:val="24"/>
       <w:szCs w:val="24"/>
     </w:rPr>
   </w:style>
   <w:style w:styleId="Date" w:type="paragraph">
     <w:name w:val="Date"/>
-    <w:basedOn w:val="Title"/>
-    <w:next w:val="BodyText"/>
+    <w:basedOn w:val="Normal"/>
+    <w:next w:val="Normal"/>
+    <w:qFormat/>
+    <w:pPr>
+      <w:spacing w:after="0" w:before="40"/>
+      <w:jc w:val="center"/>
+    </w:pPr>
+    <w:rPr>
+      <w:rFonts w:ascii="Segoe UI" w:hAnsi="Segoe UI"/>
+      <w:color w:val="808080"/>
+      <w:sz w:val="20"/>
+      <w:szCs w:val="20"/>
+    </w:rPr>
+  </w:style>
+  <w:style w:styleId="BodyText" w:type="paragraph">
+    <w:name w:val="Body Text"/>
+    <w:basedOn w:val="Normal"/>
+    <w:qFormat/>
+    <w:pPr>
+      <w:spacing w:after="120" w:before="0" w:line="288" w:lineRule="auto"/>
+    </w:pPr>
+  </w:style>
+  <w:style w:styleId="FirstParagraph" w:type="paragraph">
+    <w:name w:val="First Paragraph"/>
+    <w:basedOn w:val="BodyText"/>
+    <w:qFormat/>
+  </w:style>
+  <w:style w:styleId="Heading1" w:type="paragraph">
+    <w:name w:val="heading 1"/>
+    <w:basedOn w:val="Normal"/>
+    <w:next w:val="Normal"/>
     <w:qFormat/>
     <w:pPr>
       <w:keepNext/>
       <w:keepLines/>
+      <w:spacing w:after="120" w:before="480"/>
+      <w:outlineLvl w:val="0"/>
+      <w:pBdr>
+        <w:bottom w:color="0F6CBD" w:space="4" w:sz="6" w:val="single"/>
+      </w:pBdr>
     </w:pPr>
     <w:rPr>
-      <w:sz w:val="24"/>
-      <w:szCs w:val="24"/>
-    </w:rPr>
-  </w:style>
-  <w:style w:customStyle="1" w:styleId="AbstractTitle" w:type="paragraph">
-    <w:name w:val="Abstract Title"/>
-    <w:basedOn w:val="Normal"/>
-    <w:next w:val="Abstract"/>
-    <w:qFormat/>
-    <w:pPr>
-      <w:keepNext/>
-      <w:keepLines/>
-      <w:spacing w:after="0" w:before="300"/>
-      <w:jc w:val="center"/>
-    </w:pPr>
-    <w:rPr>
-      <w:b/>
-      <w:sz w:val="20"/>
-      <w:szCs w:val="20"/>
-    </w:rPr>
-  </w:style>
-  <w:style w:customStyle="1" w:styleId="Abstract" w:type="paragraph">
-    <w:name w:val="Abstract"/>
-    <w:basedOn w:val="Normal"/>
-    <w:next w:val="BodyText"/>
-    <w:qFormat/>
-    <w:pPr>
-      <w:keepNext/>
-      <w:keepLines/>
-      <w:spacing w:after="300" w:before="100"/>
-    </w:pPr>
-    <w:rPr>
-      <w:sz w:val="20"/>
-      <w:szCs w:val="20"/>
-    </w:rPr>
-  </w:style>
-  <w:style w:styleId="Bibliography" w:type="paragraph">
-    <w:name w:val="Bibliography"/>
-    <w:basedOn w:val="Normal"/>
-    <w:next w:val="Bibliography"/>
-    <w:qFormat/>
-    <w:pPr/>
-    <w:rPr/>
-  </w:style>
-  <w:style w:styleId="Heading1" w:type="paragraph">
-    <w:name w:val="heading 1"/>
-    <w:basedOn w:val="Normal"/>
-    <w:next w:val="BodyText"/>
-    <w:link w:val="Heading1Char"/>
-    <w:uiPriority w:val="9"/>
-    <w:qFormat/>
-    <w:rsid w:val="00A10FD9"/>
-    <w:pPr>
-      <w:keepNext/>
-      <w:keepLines/>
-      <w:spacing w:after="80" w:before="360"/>
-      <w:outlineLvl w:val="0"/>
-    </w:pPr>
-    <w:rPr>
-      <w:rFonts w:asciiTheme="majorHAnsi" w:cstheme="majorBidi" w:eastAsiaTheme="majorEastAsia" w:hAnsiTheme="majorHAnsi"/>
-      <w:color w:themeColor="accent1" w:themeShade="BF" w:val="0F4761"/>
-      <w:sz w:val="40"/>
-      <w:szCs w:val="40"/>
+      <w:rFonts w:ascii="Segoe UI Semibold" w:hAnsi="Segoe UI Semibold"/>
+      <w:color w:val="0F6CBD"/>
+      <w:sz w:val="36"/>
+      <w:szCs w:val="36"/>
     </w:rPr>
   </w:style>
   <w:style w:styleId="Heading2" w:type="paragraph">
     <w:name w:val="heading 2"/>
     <w:basedOn w:val="Normal"/>
-    <w:next w:val="BodyText"/>
-    <w:link w:val="Heading2Char"/>
-    <w:uiPriority w:val="9"/>
-    <w:semiHidden/>
-    <w:unhideWhenUsed/>
+    <w:next w:val="Normal"/>
     <w:qFormat/>
-    <w:rsid w:val="00A10FD9"/>
     <w:pPr>
       <w:keepNext/>
       <w:keepLines/>
-      <w:spacing w:after="80" w:before="160"/>
+      <w:spacing w:after="80" w:before="320"/>
       <w:outlineLvl w:val="1"/>
     </w:pPr>
     <w:rPr>
-      <w:rFonts w:asciiTheme="majorHAnsi" w:cstheme="majorBidi" w:eastAsiaTheme="majorEastAsia" w:hAnsiTheme="majorHAnsi"/>
-      <w:color w:themeColor="accent1" w:themeShade="BF" w:val="0F4761"/>
-      <w:sz w:val="32"/>
-      <w:szCs w:val="32"/>
+      <w:rFonts w:ascii="Segoe UI Semibold" w:hAnsi="Segoe UI Semibold"/>
+      <w:color w:val="2B579A"/>
+      <w:sz w:val="28"/>
+      <w:szCs w:val="28"/>
     </w:rPr>
   </w:style>
   <w:style w:styleId="Heading3" w:type="paragraph">
     <w:name w:val="heading 3"/>
     <w:basedOn w:val="Normal"/>
-    <w:next w:val="BodyText"/>
-    <w:link w:val="Heading3Char"/>
-    <w:uiPriority w:val="9"/>
-    <w:semiHidden/>
-    <w:unhideWhenUsed/>
+    <w:next w:val="Normal"/>
     <w:qFormat/>
-    <w:rsid w:val="00A10FD9"/>
     <w:pPr>
       <w:keepNext/>
       <w:keepLines/>
-      <w:spacing w:after="80" w:before="160"/>
+      <w:spacing w:after="60" w:before="240"/>
       <w:outlineLvl w:val="2"/>
     </w:pPr>
     <w:rPr>
-      <w:rFonts w:cstheme="majorBidi" w:eastAsiaTheme="majorEastAsia"/>
-      <w:color w:themeColor="accent1" w:themeShade="BF" w:val="0F4761"/>
-      <w:sz w:val="28"/>
-      <w:szCs w:val="28"/>
+      <w:rFonts w:ascii="Segoe UI Semibold" w:hAnsi="Segoe UI Semibold"/>
+      <w:color w:val="2B579A"/>
+      <w:sz w:val="24"/>
+      <w:szCs w:val="24"/>
     </w:rPr>
   </w:style>
   <w:style w:styleId="Heading4" w:type="paragraph">
     <w:name w:val="heading 4"/>
     <w:basedOn w:val="Normal"/>
-    <w:next w:val="BodyText"/>
-    <w:link w:val="Heading4Char"/>
-    <w:uiPriority w:val="9"/>
-    <w:semiHidden/>
-    <w:unhideWhenUsed/>
+    <w:next w:val="Normal"/>
     <w:qFormat/>
-    <w:rsid w:val="00A10FD9"/>
     <w:pPr>
       <w:keepNext/>
       <w:keepLines/>
-      <w:spacing w:after="40" w:before="80"/>
+      <w:spacing w:after="60" w:before="200"/>
       <w:outlineLvl w:val="3"/>
     </w:pPr>
     <w:rPr>
-      <w:rFonts w:cstheme="majorBidi" w:eastAsiaTheme="majorEastAsia"/>
-      <w:i/>
-      <w:iCs/>
-      <w:color w:themeColor="accent1" w:themeShade="BF" w:val="0F4761"/>
+      <w:rFonts w:ascii="Segoe UI Semibold" w:hAnsi="Segoe UI Semibold"/>
+      <w:color w:val="404040"/>
+      <w:sz w:val="22"/>
+      <w:szCs w:val="22"/>
     </w:rPr>
   </w:style>
   <w:style w:styleId="Heading5" w:type="paragraph">
     <w:name w:val="heading 5"/>
     <w:basedOn w:val="Normal"/>
-    <w:next w:val="BodyText"/>
-    <w:link w:val="Heading5Char"/>
-    <w:uiPriority w:val="9"/>
-    <w:semiHidden/>
-    <w:unhideWhenUsed/>
+    <w:next w:val="Normal"/>
     <w:qFormat/>
-    <w:rsid w:val="00A10FD9"/>
     <w:pPr>
       <w:keepNext/>
       <w:keepLines/>
-      <w:spacing w:after="40" w:before="80"/>
+      <w:spacing w:after="40" w:before="160"/>
       <w:outlineLvl w:val="4"/>
     </w:pPr>
     <w:rPr>
-      <w:rFonts w:cstheme="majorBidi" w:eastAsiaTheme="majorEastAsia"/>
-      <w:color w:themeColor="accent1" w:themeShade="BF" w:val="0F4761"/>
+      <w:rFonts w:ascii="Segoe UI Semibold" w:hAnsi="Segoe UI Semibold"/>
+      <w:color w:val="404040"/>
+      <w:sz w:val="20"/>
+      <w:szCs w:val="20"/>
     </w:rPr>
   </w:style>
   <w:style w:styleId="Heading6" w:type="paragraph">
     <w:name w:val="heading 6"/>
     <w:basedOn w:val="Normal"/>
-    <w:next w:val="BodyText"/>
-    <w:link w:val="Heading6Char"/>
-    <w:uiPriority w:val="9"/>
-    <w:semiHidden/>
-    <w:unhideWhenUsed/>
+    <w:next w:val="Normal"/>
     <w:qFormat/>
-    <w:rsid w:val="00A10FD9"/>
     <w:pPr>
       <w:keepNext/>
       <w:keepLines/>
-      <w:spacing w:after="0" w:before="40"/>
+      <w:spacing w:after="40" w:before="120"/>
       <w:outlineLvl w:val="5"/>
     </w:pPr>
     <w:rPr>
-      <w:rFonts w:cstheme="majorBidi" w:eastAsiaTheme="majorEastAsia"/>
+      <w:rFonts w:ascii="Segoe UI Semibold" w:hAnsi="Segoe UI Semibold"/>
       <w:i/>
-      <w:iCs/>
-      <w:color w:themeColor="text1" w:themeTint="A6" w:val="595959"/>
-    </w:rPr>
-  </w:style>
-  <w:style w:styleId="Heading7" w:type="paragraph">
-    <w:name w:val="heading 7"/>
-    <w:basedOn w:val="Normal"/>
-    <w:next w:val="BodyText"/>
-    <w:link w:val="Heading7Char"/>
-    <w:uiPriority w:val="9"/>
-    <w:semiHidden/>
-    <w:unhideWhenUsed/>
-    <w:qFormat/>
-    <w:rsid w:val="00A10FD9"/>
-    <w:pPr>
-      <w:keepNext/>
-      <w:keepLines/>
-      <w:spacing w:after="0" w:before="40"/>
-      <w:outlineLvl w:val="6"/>
-    </w:pPr>
-    <w:rPr>
-      <w:rFonts w:cstheme="majorBidi" w:eastAsiaTheme="majorEastAsia"/>
-      <w:color w:themeColor="text1" w:themeTint="A6" w:val="595959"/>
-    </w:rPr>
-  </w:style>
-  <w:style w:styleId="Heading8" w:type="paragraph">
-    <w:name w:val="heading 8"/>
-    <w:basedOn w:val="Normal"/>
-    <w:next w:val="BodyText"/>
-    <w:link w:val="Heading8Char"/>
-    <w:uiPriority w:val="9"/>
-    <w:semiHidden/>
-    <w:unhideWhenUsed/>
-    <w:qFormat/>
-    <w:rsid w:val="00A10FD9"/>
-    <w:pPr>
-      <w:keepNext/>
-      <w:keepLines/>
-      <w:spacing w:after="0"/>
-      <w:outlineLvl w:val="7"/>
-    </w:pPr>
-    <w:rPr>
-      <w:rFonts w:cstheme="majorBidi" w:eastAsiaTheme="majorEastAsia"/>
-      <w:i/>
-      <w:iCs/>
-      <w:color w:themeColor="text1" w:themeTint="D8" w:val="272727"/>
-    </w:rPr>
-  </w:style>
-  <w:style w:styleId="Heading9" w:type="paragraph">
-    <w:name w:val="heading 9"/>
-    <w:basedOn w:val="Normal"/>
-    <w:next w:val="BodyText"/>
-    <w:link w:val="Heading9Char"/>
-    <w:uiPriority w:val="9"/>
-    <w:semiHidden/>
-    <w:unhideWhenUsed/>
-    <w:qFormat/>
-    <w:rsid w:val="00A10FD9"/>
-    <w:pPr>
-      <w:keepNext/>
-      <w:keepLines/>
-      <w:spacing w:after="0"/>
-      <w:outlineLvl w:val="8"/>
-    </w:pPr>
-    <w:rPr>
-      <w:rFonts w:cstheme="majorBidi" w:eastAsiaTheme="majorEastAsia"/>
-      <w:color w:themeColor="text1" w:themeTint="D8" w:val="272727"/>
-    </w:rPr>
-  </w:style>
-  <w:style w:customStyle="1" w:styleId="Heading1Char" w:type="character">
-    <w:name w:val="Heading 1 Char"/>
-    <w:basedOn w:val="DefaultParagraphFont"/>
-    <w:link w:val="Heading1"/>
-    <w:uiPriority w:val="9"/>
-    <w:rsid w:val="00A10FD9"/>
-    <w:rPr>
-      <w:rFonts w:asciiTheme="majorHAnsi" w:cstheme="majorBidi" w:eastAsiaTheme="majorEastAsia" w:hAnsiTheme="majorHAnsi"/>
-      <w:color w:themeColor="accent1" w:themeShade="BF" w:val="0F4761"/>
-      <w:sz w:val="40"/>
-      <w:szCs w:val="40"/>
-    </w:rPr>
-  </w:style>
-  <w:style w:customStyle="1" w:styleId="Heading2Char" w:type="character">
-    <w:name w:val="Heading 2 Char"/>
-    <w:basedOn w:val="DefaultParagraphFont"/>
-    <w:link w:val="Heading2"/>
-    <w:uiPriority w:val="9"/>
-    <w:semiHidden/>
-    <w:rsid w:val="00A10FD9"/>
-    <w:rPr>
-      <w:rFonts w:asciiTheme="majorHAnsi" w:cstheme="majorBidi" w:eastAsiaTheme="majorEastAsia" w:hAnsiTheme="majorHAnsi"/>
-      <w:color w:themeColor="accent1" w:themeShade="BF" w:val="0F4761"/>
-      <w:sz w:val="32"/>
-      <w:szCs w:val="32"/>
-    </w:rPr>
-  </w:style>
-  <w:style w:customStyle="1" w:styleId="Heading3Char" w:type="character">
-    <w:name w:val="Heading 3 Char"/>
-    <w:basedOn w:val="DefaultParagraphFont"/>
-    <w:link w:val="Heading3"/>
-    <w:uiPriority w:val="9"/>
-    <w:semiHidden/>
-    <w:rsid w:val="00A10FD9"/>
-    <w:rPr>
-      <w:rFonts w:cstheme="majorBidi" w:eastAsiaTheme="majorEastAsia"/>
-      <w:color w:themeColor="accent1" w:themeShade="BF" w:val="0F4761"/>
-      <w:sz w:val="28"/>
-      <w:szCs w:val="28"/>
-    </w:rPr>
-  </w:style>
-  <w:style w:customStyle="1" w:styleId="Heading4Char" w:type="character">
-    <w:name w:val="Heading 4 Char"/>
-    <w:basedOn w:val="DefaultParagraphFont"/>
-    <w:link w:val="Heading4"/>
-    <w:uiPriority w:val="9"/>
-    <w:semiHidden/>
-    <w:rsid w:val="00A10FD9"/>
-    <w:rPr>
-      <w:rFonts w:cstheme="majorBidi" w:eastAsiaTheme="majorEastAsia"/>
-      <w:i/>
-      <w:iCs/>
-      <w:color w:themeColor="accent1" w:themeShade="BF" w:val="0F4761"/>
-    </w:rPr>
-  </w:style>
-  <w:style w:customStyle="1" w:styleId="Heading5Char" w:type="character">
-    <w:name w:val="Heading 5 Char"/>
-    <w:basedOn w:val="DefaultParagraphFont"/>
-    <w:link w:val="Heading5"/>
-    <w:uiPriority w:val="9"/>
-    <w:semiHidden/>
-    <w:rsid w:val="00A10FD9"/>
-    <w:rPr>
-      <w:rFonts w:cstheme="majorBidi" w:eastAsiaTheme="majorEastAsia"/>
-      <w:color w:themeColor="accent1" w:themeShade="BF" w:val="0F4761"/>
-    </w:rPr>
-  </w:style>
-  <w:style w:customStyle="1" w:styleId="Heading6Char" w:type="character">
-    <w:name w:val="Heading 6 Char"/>
-    <w:basedOn w:val="DefaultParagraphFont"/>
-    <w:link w:val="Heading6"/>
-    <w:uiPriority w:val="9"/>
-    <w:semiHidden/>
-    <w:rsid w:val="00A10FD9"/>
-    <w:rPr>
-      <w:rFonts w:cstheme="majorBidi" w:eastAsiaTheme="majorEastAsia"/>
-      <w:i/>
-      <w:iCs/>
-      <w:color w:themeColor="text1" w:themeTint="A6" w:val="595959"/>
-    </w:rPr>
-  </w:style>
-  <w:style w:customStyle="1" w:styleId="Heading7Char" w:type="character">
-    <w:name w:val="Heading 7 Char"/>
-    <w:basedOn w:val="DefaultParagraphFont"/>
-    <w:link w:val="Heading7"/>
-    <w:uiPriority w:val="9"/>
-    <w:semiHidden/>
-    <w:rsid w:val="00A10FD9"/>
-    <w:rPr>
-      <w:rFonts w:cstheme="majorBidi" w:eastAsiaTheme="majorEastAsia"/>
-      <w:color w:themeColor="text1" w:themeTint="A6" w:val="595959"/>
-    </w:rPr>
-  </w:style>
-  <w:style w:customStyle="1" w:styleId="Heading8Char" w:type="character">
-    <w:name w:val="Heading 8 Char"/>
-    <w:basedOn w:val="DefaultParagraphFont"/>
-    <w:link w:val="Heading8"/>
-    <w:uiPriority w:val="9"/>
-    <w:semiHidden/>
-    <w:rsid w:val="00A10FD9"/>
-    <w:rPr>
-      <w:rFonts w:cstheme="majorBidi" w:eastAsiaTheme="majorEastAsia"/>
-      <w:i/>
-      <w:iCs/>
-      <w:color w:themeColor="text1" w:themeTint="D8" w:val="272727"/>
-    </w:rPr>
-  </w:style>
-  <w:style w:customStyle="1" w:styleId="Heading9Char" w:type="character">
-    <w:name w:val="Heading 9 Char"/>
-    <w:basedOn w:val="DefaultParagraphFont"/>
-    <w:link w:val="Heading9"/>
-    <w:uiPriority w:val="9"/>
-    <w:semiHidden/>
-    <w:rsid w:val="00A10FD9"/>
-    <w:rPr>
-      <w:rFonts w:cstheme="majorBidi" w:eastAsiaTheme="majorEastAsia"/>
-      <w:color w:themeColor="text1" w:themeTint="D8" w:val="272727"/>
+      <w:color w:val="595959"/>
+      <w:sz w:val="20"/>
+      <w:szCs w:val="20"/>
     </w:rPr>
   </w:style>
   <w:style w:styleId="BlockText" w:type="paragraph">
     <w:name w:val="Block Text"/>
-    <w:basedOn w:val="BodyText"/>
-    <w:next w:val="BodyText"/>
-    <w:uiPriority w:val="9"/>
-    <w:unhideWhenUsed/>
+    <w:basedOn w:val="Normal"/>
     <w:qFormat/>
     <w:pPr>
-      <w:spacing w:after="100" w:before="100"/>
-      <w:ind w:firstLine="0" w:left="480" w:right="480"/>
+      <w:spacing w:after="160" w:before="160"/>
+      <w:ind w:left="360"/>
+      <w:pBdr>
+        <w:left w:color="0F6CBD" w:space="8" w:sz="24" w:val="single"/>
+      </w:pBdr>
+      <w:shd w:color="auto" w:fill="EAF3FB" w:val="clear"/>
+    </w:pPr>
+    <w:rPr>
+      <w:i/>
+      <w:color w:val="2B579A"/>
+    </w:rPr>
+  </w:style>
+  <w:style w:styleId="SourceCode" w:type="paragraph">
+    <w:name w:val="Source Code"/>
+    <w:basedOn w:val="Normal"/>
+    <w:qFormat/>
+    <w:pPr>
+      <w:spacing w:after="0" w:before="0" w:line="240" w:lineRule="auto"/>
+      <w:shd w:color="auto" w:fill="F5F5F5" w:val="clear"/>
+      <w:ind w:left="120" w:right="120"/>
+    </w:pPr>
+    <w:rPr>
+      <w:rFonts w:ascii="Cascadia Mono" w:cs="Cascadia Mono" w:hAnsi="Cascadia Mono"/>
+      <w:sz w:val="18"/>
+      <w:szCs w:val="18"/>
+    </w:rPr>
+  </w:style>
+  <w:style w:styleId="VerbatimChar" w:type="character">
+    <w:name w:val="Verbatim Char"/>
+    <w:qFormat/>
+    <w:rPr>
+      <w:rFonts w:ascii="Cascadia Mono" w:cs="Cascadia Mono" w:hAnsi="Cascadia Mono"/>
+      <w:sz w:val="18"/>
+      <w:szCs w:val="18"/>
+      <w:shd w:color="auto" w:fill="F5F5F5" w:val="clear"/>
+    </w:rPr>
+  </w:style>
+  <w:style w:styleId="Caption" w:type="paragraph">
+    <w:name w:val="caption"/>
+    <w:basedOn w:val="Normal"/>
+    <w:next w:val="Normal"/>
+    <w:qFormat/>
+    <w:pPr>
+      <w:spacing w:after="160" w:before="40"/>
+    </w:pPr>
+    <w:rPr>
+      <w:i/>
+      <w:color w:val="595959"/>
+      <w:sz w:val="18"/>
+    </w:rPr>
+  </w:style>
+  <w:style w:styleId="TOC1" w:type="paragraph">
+    <w:name w:val="toc 1"/>
+    <w:basedOn w:val="Normal"/>
+    <w:next w:val="Normal"/>
+    <w:pPr>
+      <w:tabs>
+        <w:tab w:leader="dot" w:pos="9000" w:val="right"/>
+      </w:tabs>
+      <w:spacing w:after="80" w:before="80"/>
+    </w:pPr>
+    <w:rPr>
+      <w:b/>
+      <w:color w:val="2B579A"/>
+    </w:rPr>
+  </w:style>
+  <w:style w:styleId="TOC2" w:type="paragraph">
+    <w:name w:val="toc 2"/>
+    <w:basedOn w:val="Normal"/>
+    <w:next w:val="Normal"/>
+    <w:pPr>
+      <w:tabs>
+        <w:tab w:leader="dot" w:pos="9000" w:val="right"/>
+      </w:tabs>
+      <w:spacing w:after="20" w:before="20"/>
+      <w:ind w:left="240"/>
     </w:pPr>
   </w:style>
-  <w:style w:styleId="FootnoteText" w:type="paragraph">
-    <w:name w:val="Footnote Text"/>
-    <w:basedOn w:val="Normal"/>
-    <w:next w:val="FootnoteText"/>
-    <w:uiPriority w:val="9"/>
-    <w:unhideWhenUsed/>
+  <w:style w:styleId="TOCHeading" w:type="paragraph">
+    <w:name w:val="TOC Heading"/>
+    <w:basedOn w:val="Heading1"/>
+    <w:next w:val="Normal"/>
     <w:qFormat/>
   </w:style>
-  <w:style w:styleId="FootnoteBlockText" w:type="paragraph">
-    <w:name w:val="Footnote Block Text"/>
-    <w:basedOn w:val="FootnoteText"/>
-    <w:next w:val="FootnoteText"/>
-    <w:uiPriority w:val="9"/>
-    <w:unhideWhenUsed/>
-    <w:qFormat/>
+  <w:style w:styleId="Header" w:type="paragraph">
+    <w:name w:val="header"/>
+    <w:basedOn w:val="Normal"/>
     <w:pPr>
-      <w:spacing w:after="100" w:before="100"/>
-      <w:ind w:firstLine="0" w:left="480" w:right="480"/>
+      <w:tabs>
+        <w:tab w:pos="4680" w:val="center"/>
+        <w:tab w:pos="9360" w:val="right"/>
+      </w:tabs>
+      <w:spacing w:after="0"/>
     </w:pPr>
+    <w:rPr>
+      <w:color w:val="808080"/>
+      <w:sz w:val="18"/>
+    </w:rPr>
   </w:style>
-  <w:style w:default="1" w:styleId="DefaultParagraphFont" w:type="character">
-    <w:name w:val="Default Paragraph Font"/>
+  <w:style w:styleId="Footer" w:type="paragraph">
+    <w:name w:val="footer"/>
+    <w:basedOn w:val="Normal"/>
+    <w:pPr>
+      <w:tabs>
+        <w:tab w:pos="4680" w:val="center"/>
+        <w:tab w:pos="9360" w:val="right"/>
+      </w:tabs>
+      <w:spacing w:after="0"/>
+    </w:pPr>
+    <w:rPr>
+      <w:color w:val="808080"/>
+      <w:sz w:val="18"/>
+    </w:rPr>
+  </w:style>
+  <w:style w:default="1" w:styleId="TableNormal" w:type="table">
+    <w:name w:val="Normal Table"/>
+    <w:uiPriority w:val="99"/>
     <w:semiHidden/>
     <w:unhideWhenUsed/>
-  </w:style>
-  <w:style w:default="1" w:styleId="Table" w:type="table">
-    <w:name w:val="Table"/>
-    <w:basedOn w:val="TableNormal"/>
-    <w:semiHidden/>
-    <w:unhideWhenUsed/>
-    <w:qFormat/>
     <w:tblPr>
       <w:tblInd w:type="dxa" w:w="0"/>
       <w:tblCellMar>
@@ -10121,120 +9998,58 @@
         <w:right w:type="dxa" w:w="108"/>
       </w:tblCellMar>
     </w:tblPr>
+  </w:style>
+  <w:style w:styleId="Table" w:type="table">
+    <w:name w:val="Table"/>
+    <w:basedOn w:val="TableNormal"/>
+    <w:tblPr>
+      <w:tblBorders>
+        <w:top w:color="BFBFBF" w:space="0" w:sz="4" w:val="single"/>
+        <w:left w:color="BFBFBF" w:space="0" w:sz="4" w:val="single"/>
+        <w:bottom w:color="BFBFBF" w:space="0" w:sz="4" w:val="single"/>
+        <w:right w:color="BFBFBF" w:space="0" w:sz="4" w:val="single"/>
+        <w:insideH w:color="E7E6E6" w:space="0" w:sz="4" w:val="single"/>
+        <w:insideV w:color="E7E6E6" w:space="0" w:sz="4" w:val="single"/>
+      </w:tblBorders>
+      <w:tblCellMar>
+        <w:top w:type="dxa" w:w="100"/>
+        <w:left w:type="dxa" w:w="140"/>
+        <w:bottom w:type="dxa" w:w="100"/>
+        <w:right w:type="dxa" w:w="140"/>
+      </w:tblCellMar>
+    </w:tblPr>
+    <w:rPr>
+      <w:sz w:val="20"/>
+      <w:szCs w:val="20"/>
+    </w:rPr>
     <w:tblStylePr w:type="firstRow">
+      <w:rPr>
+        <w:rFonts w:ascii="Segoe UI Semibold" w:hAnsi="Segoe UI Semibold"/>
+        <w:b/>
+        <w:color w:val="FFFFFF"/>
+        <w:sz w:val="20"/>
+      </w:rPr>
       <w:tcPr>
-        <w:tcBorders>
-          <w:bottom w:val="single"/>
-        </w:tcBorders>
-        <w:vAlign w:val="bottom"/>
+        <w:shd w:color="auto" w:fill="0F6CBD" w:val="clear"/>
+      </w:tcPr>
+    </w:tblStylePr>
+    <w:tblStylePr w:type="band1Horz">
+      <w:tcPr>
+        <w:shd w:color="auto" w:fill="F2F7FC" w:val="clear"/>
+      </w:tcPr>
+    </w:tblStylePr>
+    <w:tblStylePr w:type="band2Horz">
+      <w:tcPr>
+        <w:shd w:color="auto" w:fill="FFFFFF" w:val="clear"/>
       </w:tcPr>
     </w:tblStylePr>
   </w:style>
-  <w:style w:customStyle="1" w:styleId="DefinitionTerm" w:type="paragraph">
-    <w:name w:val="Definition Term"/>
+  <w:style w:styleId="CompactParagraph" w:type="paragraph">
+    <w:name w:val="Compact"/>
     <w:basedOn w:val="Normal"/>
-    <w:next w:val="Definition"/>
-    <w:pPr>
-      <w:keepNext/>
-      <w:keepLines/>
-      <w:spacing w:after="0"/>
-    </w:pPr>
-    <w:rPr>
-      <w:b/>
-    </w:rPr>
-  </w:style>
-  <w:style w:customStyle="1" w:styleId="Definition" w:type="paragraph">
-    <w:name w:val="Definition"/>
-    <w:basedOn w:val="Normal"/>
-  </w:style>
-  <w:style w:styleId="Caption" w:type="paragraph">
-    <w:name w:val="Caption"/>
-    <w:basedOn w:val="Normal"/>
-    <w:link w:val="BodyTextChar"/>
-    <w:pPr>
-      <w:spacing w:after="120" w:before="0"/>
-    </w:pPr>
-    <w:rPr>
-      <w:i/>
-    </w:rPr>
-  </w:style>
-  <w:style w:customStyle="1" w:styleId="TableCaption" w:type="paragraph">
-    <w:name w:val="Table Caption"/>
-    <w:basedOn w:val="Caption"/>
-    <w:pPr>
-      <w:keepNext/>
-    </w:pPr>
-  </w:style>
-  <w:style w:customStyle="1" w:styleId="ImageCaption" w:type="paragraph">
-    <w:name w:val="Image Caption"/>
-    <w:basedOn w:val="Caption"/>
-  </w:style>
-  <w:style w:customStyle="1" w:styleId="Figure" w:type="paragraph">
-    <w:name w:val="Figure"/>
-    <w:basedOn w:val="Normal"/>
-  </w:style>
-  <w:style w:customStyle="1" w:styleId="CaptionedFigure" w:type="paragraph">
-    <w:name w:val="Captioned Figure"/>
-    <w:basedOn w:val="Figure"/>
-    <w:pPr>
-      <w:keepNext/>
-    </w:pPr>
-  </w:style>
-  <w:style w:customStyle="1" w:styleId="BodyTextChar" w:type="character">
-    <w:name w:val="Body Text Char"/>
-    <w:basedOn w:val="DefaultParagraphFont"/>
-    <w:link w:val="BodyText"/>
-  </w:style>
-  <w:style w:customStyle="1" w:styleId="VerbatimChar" w:type="character">
-    <w:name w:val="Verbatim Char"/>
-    <w:basedOn w:val="BodyTextChar"/>
-    <w:rPr>
-      <w:rFonts w:ascii="Consolas" w:hAnsi="Consolas"/>
-      <w:sz w:val="22"/>
-    </w:rPr>
-  </w:style>
-  <w:style w:customStyle="1" w:styleId="SectionNumber" w:type="character">
-    <w:name w:val="Section Number"/>
-    <w:basedOn w:val="BodyTextChar"/>
-  </w:style>
-  <w:style w:styleId="FootnoteReference" w:type="character">
-    <w:name w:val="Footnote Reference"/>
-    <w:basedOn w:val="BodyTextChar"/>
-    <w:rPr>
-      <w:vertAlign w:val="superscript"/>
-    </w:rPr>
-  </w:style>
-  <w:style w:styleId="Hyperlink" w:type="character">
-    <w:name w:val="Hyperlink"/>
-    <w:basedOn w:val="BodyTextChar"/>
-    <w:rPr>
-      <w:color w:themeColor="accent1" w:val="4F81BD"/>
-    </w:rPr>
-  </w:style>
-  <w:style w:styleId="TOCHeading" w:type="paragraph">
-    <w:name w:val="TOC Heading"/>
-    <w:basedOn w:val="Heading1"/>
-    <w:next w:val="BodyText"/>
-    <w:uiPriority w:val="39"/>
-    <w:unhideWhenUsed/>
     <w:qFormat/>
     <w:pPr>
-      <w:spacing w:before="240" w:line="259" w:lineRule="auto"/>
-      <w:outlineLvl w:val="9"/>
-    </w:pPr>
-    <w:rPr>
-      <w:rFonts w:asciiTheme="majorHAnsi" w:cstheme="majorBidi" w:eastAsiaTheme="majorEastAsia" w:hAnsiTheme="majorHAnsi"/>
-      <w:b w:val="0"/>
-      <w:bCs w:val="0"/>
-      <w:color w:themeColor="accent1" w:themeShade="BF" w:val="365F91"/>
-    </w:rPr>
-  </w:style>
-  <w:style w:type="paragraph" w:customStyle="1" w:styleId="SourceCode">
-    <w:name w:val="Source Code"/>
-    <w:basedOn w:val="Normal"/>
-    <w:link w:val="VerbatimChar"/>
-    <w:pPr>
-      <w:wordWrap w:val="off"/>
+      <w:spacing w:after="0" w:before="0"/>
     </w:pPr>
   </w:style>
   <w:style w:type="character" w:customStyle="1" w:styleId="KeywordTok">

</xml_diff>